<commit_message>
Agregar manual Word y anexo completo de código verificado
</commit_message>
<xml_diff>
--- a/docs/FONCEP_Manual_tecnico_y_codigo.docx
+++ b/docs/FONCEP_Manual_tecnico_y_codigo.docx
@@ -25,7 +25,7 @@
     </w:p>
     <w:p>
       <w:r>
-        <w:t>Versión documentada: 56c3d3351c05dec873ad03a79229c55810fc8af2</w:t>
+        <w:t>Versión documentada: d833fd8f00ea7bc127f380df4452c00ff74f2792</w:t>
       </w:r>
     </w:p>
     <w:p>
@@ -203,12 +203,17 @@
       </w:hyperlink>
       <w:r/>
       <w:r>
-        <w:t xml:space="preserve"> . Fecha de elaboración: 10 de octubre de 2026. Versión de código examinada: 56c3d3351c05dec873ad03a79229c55810fc8af2.</w:t>
+        <w:t xml:space="preserve"> . Fecha de elaboración: 10 de octubre de 2026. Versión de código examinada: d833fd8f00ea7bc127f380df4452c00ff74f2792.</w:t>
       </w:r>
     </w:p>
     <w:p>
       <w:r>
         <w:t>El informe distingue las actuaciones realizadas, las funciones presentes en el código y las comprobaciones efectivamente ejecutadas. No equivale a una certificación de seguridad ni a una auditoría archivística o jurídica. Tampoco implica que ya se hayan organizado todos los expedientes reales de la carpeta original.</w:t>
+      </w:r>
+    </w:p>
+    <w:p>
+      <w:r>
+        <w:t>Actualización del catálogo integrado: la aplicación abre con los 19 tipos de Tipos_Documentales_Cuotas_Partes_Escalamiento.xlsx, versión del 9 de octubre de 2026. Se conservaron exactamente los códigos y descripciones del archivo encontrado en la carpeta de trabajo. Solo se incorporó la lista de tipos, no expedientes, el correo ni el libro completo.</w:t>
       </w:r>
     </w:p>
     <w:p>
@@ -325,6 +330,11 @@
     <w:p>
       <w:r>
         <w:t>17. Preparar este informe y su anexo completo de código a partir de la versión fijada, para que la explicación pueda contrastarse con los archivos reales.</w:t>
+      </w:r>
+    </w:p>
+    <w:p>
+      <w:r>
+        <w:t>18. Incorporar como predeterminados los 19 tipos documentales del Excel indicado por el usuario. Crear catalog.js, mostrar código y descripción, iniciar el catálogo al abrir, conservar el reemplazo opcional por Excel/CSV y añadir Restaurar catálogo incluido. Eliminar del HTML un fragmento de desafío del alojamiento anterior que llegó con la migración; no forma parte de la aplicación.</w:t>
       </w:r>
     </w:p>
     <w:p>
@@ -849,6 +859,11 @@
       </w:hyperlink>
       <w:r/>
       <w:r/>
+    </w:p>
+    <w:p>
+      <w:r>
+        <w:t>catalog.js contiene únicamente los nombres y códigos de los tipos documentales y se publica junto al resto del código. Ese catálogo queda visible al ser el sitio y repositorio públicos; no se incorporan datos de ciudadanos ni expedientes. No se requiere conexión con OneDrive para obtenerlo en cada sesión.</w:t>
+      </w:r>
     </w:p>
     <w:p>
       <w:pPr>
@@ -1887,7 +1902,7 @@
     </w:p>
     <w:p>
       <w:r>
-        <w:t>3. Cargar el catálogo oficial Excel o CSV. Elegir la hoja, la columna que contiene los nombres y la primera fila de datos. Revisar la lista antes de aplicar.</w:t>
+        <w:t>3. El catálogo incluido ya está activo con 19 tipos documentales. Desplegar la lista para revisar códigos y descripciones. No necesitas cargar ningún Excel para utilizar esos tipos. Solo si cambia el catálogo, abrir Usar otro catálogo (opcional), seleccionar Excel/CSV, hoja, columna y primera fila, y aplicar.</w:t>
       </w:r>
     </w:p>
     <w:p>
@@ -1897,7 +1912,7 @@
     </w:p>
     <w:p>
       <w:r>
-        <w:t>5. Elegir el expediente activo y navegar sus páginas. Verificar si existe texto extraíble o si necesita reconocimiento OCR.</w:t>
+        <w:t>5. Elegir el expediente activo y navegar sus páginas. Verificar si existe texto extraíble o si necesita reconocimiento OCR. Puedes restaurar el catálogo oficial con Restaurar catálogo incluido; este cambio exige revisar de nuevo las aprobaciones.</w:t>
       </w:r>
     </w:p>
     <w:p>
@@ -1932,7 +1947,7 @@
     </w:p>
     <w:p>
       <w:r>
-        <w:t>12. Guardar el plan JSON si necesitas continuar luego. El plan no contiene los PDF; conserva los originales y el catálogo. Para recuperarlo, vuelve a cargarlos y revisa nuevamente.</w:t>
+        <w:t>12. Guardar el plan JSON si necesitas continuar luego. El plan no contiene los PDF; conserva los originales. Para recuperarlo, vuelve a cargar los originales y usa el mismo catálogo, integrado o personalizado, con que creaste el plan; revisa y aprueba de nuevo.</w:t>
       </w:r>
     </w:p>
     <w:p>
@@ -3163,7 +3178,7 @@
         <w:pStyle w:val="ListBullet"/>
       </w:pPr>
       <w:r>
-        <w:t>verify.cjs comprobó que los cuatro archivos JavaScript propios compilan como scripts, que la página contiene sus referencias y que existen recursos OCR/PDF con tamaño mínimo.</w:t>
+        <w:t>verify.cjs comprobó que los archivos JavaScript propios, incluido catalog.js compilan como scripts, que la página contiene sus referencias y que existen recursos OCR/PDF con tamaño mínimo.</w:t>
       </w:r>
     </w:p>
     <w:p>
@@ -3532,6 +3547,56 @@
                 <w:sz w:val="18"/>
               </w:rPr>
               <w:t>safeName, validate, coverage y csv.</w:t>
+            </w:r>
+          </w:p>
+        </w:tc>
+      </w:tr>
+      <w:tr>
+        <w:tc>
+          <w:tcPr>
+            <w:tcW w:type="dxa" w:w="3213"/>
+          </w:tcPr>
+          <w:p>
+            <w:pPr>
+              <w:spacing w:after="80"/>
+            </w:pPr>
+            <w:r>
+              <w:rPr>
+                <w:sz w:val="18"/>
+              </w:rPr>
+              <w:t>dist/catalog.js</w:t>
+            </w:r>
+          </w:p>
+        </w:tc>
+        <w:tc>
+          <w:tcPr>
+            <w:tcW w:type="dxa" w:w="3213"/>
+          </w:tcPr>
+          <w:p>
+            <w:pPr>
+              <w:spacing w:after="80"/>
+            </w:pPr>
+            <w:r>
+              <w:rPr>
+                <w:sz w:val="18"/>
+              </w:rPr>
+              <w:t>Catálogo predeterminado.</w:t>
+            </w:r>
+          </w:p>
+        </w:tc>
+        <w:tc>
+          <w:tcPr>
+            <w:tcW w:type="dxa" w:w="3213"/>
+          </w:tcPr>
+          <w:p>
+            <w:pPr>
+              <w:spacing w:after="80"/>
+            </w:pPr>
+            <w:r>
+              <w:rPr>
+                <w:sz w:val="18"/>
+              </w:rPr>
+              <w:t>19 códigos y descripciones exactos; referencia del archivo origen y restauración desde la interfaz.</w:t>
             </w:r>
           </w:p>
         </w:tc>
@@ -4662,7 +4727,7 @@
             <w:color w:val="14665C"/>
             <w:u w:val="single"/>
           </w:rPr>
-          <w:t>https://github.com/deivy199130-arch/foncep-organizador/tree/56c3d3351c05dec873ad03a79229c55810fc8af2</w:t>
+          <w:t>https://github.com/deivy199130-arch/foncep-organizador/tree/d833fd8f00ea7bc127f380df4452c00ff74f2792</w:t>
         </w:r>
       </w:hyperlink>
       <w:r/>
@@ -4885,7 +4950,7 @@
     </w:p>
     <w:p>
       <w:r>
-        <w:t>Cada bloque reproduce íntegramente un archivo de la versión 56c3d3351c05dec873ad03a79229c55810fc8af2. La numeración de seis dígitos y el separador | son ayudas de lectura añadidas para este informe y no pertenecen al código. Los saltos visuales por ancho de página no representan nuevas líneas del archivo. No se omiten cuerpos de funciones.</w:t>
+        <w:t>Cada bloque reproduce íntegramente un archivo de la versión d833fd8f00ea7bc127f380df4452c00ff74f2792. La numeración de seis dígitos y el separador | son ayudas de lectura añadidas para este informe y no pertenecen al código. Los saltos visuales por ancho de página no representan nuevas líneas del archivo. No se omiten cuerpos de funciones.</w:t>
       </w:r>
     </w:p>
     <w:p>
@@ -4898,7 +4963,7 @@
     </w:p>
     <w:p>
       <w:r>
-        <w:t>SHA-256 del archivo: 047b5edce8fc309ddfa43bcf63c4da86f1b6c731d81197c855c790f2e2e11f7b</w:t>
+        <w:t>SHA-256 del archivo: 6862721175d21886064e7874761d7a5b630cad9414c97ac6a94e2d473f9afcb5</w:t>
       </w:r>
     </w:p>
     <w:p>
@@ -4911,7 +4976,7 @@
             <w:color w:val="14665C"/>
             <w:u w:val="single"/>
           </w:rPr>
-          <w:t>https://github.com/deivy199130-arch/foncep-organizador/blob/56c3d3351c05dec873ad03a79229c55810fc8af2/dist/index.html</w:t>
+          <w:t>https://github.com/deivy199130-arch/foncep-organizador/blob/d833fd8f00ea7bc127f380df4452c00ff74f2792/dist/index.html</w:t>
         </w:r>
       </w:hyperlink>
       <w:r/>
@@ -4927,7 +4992,7 @@
         <w:pStyle w:val="SourceCode"/>
       </w:pPr>
       <w:r>
-        <w:t>000001 | &lt;!doctype html&gt;&lt;html lang="es"&gt;&lt;head&gt;&lt;meta charset="utf-8"&gt;&lt;meta name="viewport" content="width=device-width,initial-scale=1"&gt;&lt;meta name="theme-color" content="#123e38"&gt;&lt;title&gt;FONCEP · Organizador documental&lt;/title&gt;&lt;link rel="stylesheet" href="styles.css"&gt;&lt;script defer src="vendor/pdf-lib.min.js"&gt;&lt;/script&gt;&lt;script defer src="vendor/jszip.min.js"&gt;&lt;/script&gt;&lt;script defer src="vendor/xlsx.full.min.js"&gt;&lt;/script&gt;&lt;script defer src="vendor/pdf.min.js"&gt;&lt;/script&gt;&lt;script defer src="core.js"&gt;&lt;/script&gt;&lt;script defer src="vendor/ocr/tesseract.min.js"&gt;&lt;/script&gt;&lt;script defer src="ocr.js"&gt;&lt;/script&gt;&lt;script defer src="analyze.js"&gt;&lt;/script&gt;&lt;script defer src="app.js"&gt;&lt;/script&gt;&lt;/head&gt;&lt;body&gt;</w:t>
+        <w:t>000001 | &lt;!doctype html&gt;&lt;html lang="es"&gt;&lt;head&gt;&lt;meta charset="utf-8"&gt;&lt;meta name="viewport" content="width=device-width,initial-scale=1"&gt;&lt;meta name="theme-color" content="#123e38"&gt;&lt;title&gt;FONCEP · Organizador documental&lt;/title&gt;&lt;link rel="stylesheet" href="styles.css"&gt;&lt;script defer src="vendor/pdf-lib.min.js"&gt;&lt;/script&gt;&lt;script defer src="vendor/jszip.min.js"&gt;&lt;/script&gt;&lt;script defer src="vendor/xlsx.full.min.js"&gt;&lt;/script&gt;&lt;script defer src="vendor/pdf.min.js"&gt;&lt;/script&gt;&lt;script defer src="core.js"&gt;&lt;/script&gt;&lt;script defer src="catalog.js"&gt;&lt;/script&gt;&lt;script defer src="vendor/ocr/tesseract.min.js"&gt;&lt;/script&gt;&lt;script defer src="ocr.js"&gt;&lt;/script&gt;&lt;script defer src="analyze.js"&gt;&lt;/script&gt;&lt;script defer src="app.js"&gt;&lt;/script&gt;&lt;/head&gt;&lt;body&gt;</w:t>
       </w:r>
     </w:p>
     <w:p>
@@ -4959,15 +5024,15 @@
         <w:pStyle w:val="SourceCode"/>
       </w:pPr>
       <w:r>
-        <w:t>000005 | &lt;div id="status" role="status" aria-live="polite"&gt;Empieza con el catálogo de tipos documentales.&lt;/div&gt;</w:t>
-      </w:r>
-    </w:p>
-    <w:p>
-      <w:pPr>
-        <w:pStyle w:val="SourceCode"/>
-      </w:pPr>
-      <w:r>
-        <w:t>000006 | &lt;section class="card" id="catalogo"&gt;&lt;div class="sectionhead"&gt;&lt;span class="step"&gt;01&lt;/span&gt;&lt;div&gt;&lt;h2&gt;Tu catálogo oficial&lt;/h2&gt;&lt;p&gt;Carga el Excel o CSV y selecciona la columna de nombres.&lt;/p&gt;&lt;/div&gt;&lt;/div&gt;&lt;label class="upload"&gt;Seleccionar catálogo&lt;input id="catalogFile" type="file" accept=".xlsx,.xls,.csv"&gt;&lt;/label&gt;&lt;div id="catalogSettings" hidden&gt;&lt;div class="fields"&gt;&lt;label&gt;Hoja&lt;select id="sheet"&gt;&lt;/select&gt;&lt;/label&gt;&lt;label&gt;Columna&lt;select id="column"&gt;&lt;/select&gt;&lt;/label&gt;&lt;label&gt;Primera fila de datos&lt;input id="firstRow" type="number" min="1" value="2"&gt;&lt;/label&gt;&lt;/div&gt;&lt;button id="applyCatalog" class="primary"&gt;Usar esta columna&lt;/button&gt;&lt;div id="sheetPreview" class="previewtext"&gt;&lt;/div&gt;&lt;/div&gt;&lt;details id="typesDetails" hidden&gt;&lt;summary id="typesCount"&gt;&lt;/summary&gt;&lt;ul id="typesList"&gt;&lt;/ul&gt;&lt;/details&gt;&lt;p class="hint"&gt;El catálogo debe contener solo tipos documentales, sin notas ni subtotales.&lt;/p&gt;&lt;/section&gt;</w:t>
+        <w:t>000005 | &lt;div id="status" role="status" aria-live="polite"&gt;El catálogo incluido está listo. Carga los expedientes PDF.&lt;/div&gt;</w:t>
+      </w:r>
+    </w:p>
+    <w:p>
+      <w:pPr>
+        <w:pStyle w:val="SourceCode"/>
+      </w:pPr>
+      <w:r>
+        <w:t>000006 | &lt;section class="card" id="catalogo"&gt;&lt;div class="sectionhead"&gt;&lt;span class="step"&gt;01&lt;/span&gt;&lt;div&gt;&lt;h2&gt;Catálogo incluido&lt;/h2&gt;&lt;p&gt;Los 19 tipos documentales de Cuotas Partes ya están disponibles. Puedes empezar cargando los PDF.&lt;/p&gt;&lt;/div&gt;&lt;/div&gt;&lt;p class="hint"&gt;Fuente: Tipos_Documentales_Cuotas_Partes_Escalamiento.xlsx · versión del 9 de octubre de 2026. Los documentos se nombran con la descripción del tipo; su código se muestra como referencia.&lt;/p&gt;&lt;details id="typesDetails" hidden&gt;&lt;summary id="typesCount"&gt;&lt;/summary&gt;&lt;ul id="typesList"&gt;&lt;/ul&gt;&lt;/details&gt;&lt;button id="restoreCatalog" class="secondary"&gt;Restaurar catálogo incluido&lt;/button&gt;&lt;details&gt;&lt;summary&gt;Usar otro catálogo (opcional)&lt;/summary&gt;&lt;p class="hint"&gt;Solo necesitas cargar un Excel o CSV si cambia el catálogo o vas a trabajar con otros tipos. Al reemplazarlo tendrás que revisar de nuevo las aprobaciones.&lt;/p&gt;&lt;label class="upload"&gt;Seleccionar catálogo actualizado&lt;input id="catalogFile" type="file" accept=".xlsx,.xls,.csv"&gt;&lt;/label&gt;&lt;div id="catalogSettings" hidden&gt;&lt;div class="fields"&gt;&lt;label&gt;Hoja&lt;select id="sheet"&gt;&lt;/select&gt;&lt;/label&gt;&lt;label&gt;Columna&lt;select id="column"&gt;&lt;/select&gt;&lt;/label&gt;&lt;label&gt;Primera fila de datos&lt;input id="firstRow" type="number" min="1" value="2"&gt;&lt;/label&gt;&lt;/div&gt;&lt;button id="applyCatalog" class="primary"&gt;Usar esta columna&lt;/button&gt;&lt;div id="sheetPreview" class="previewtext"&gt;&lt;/div&gt;&lt;/div&gt;&lt;p class="hint"&gt;La columna debe contener solo los nombres de tipos documentales, sin notas ni subtotales.&lt;/p&gt;&lt;/details&gt;&lt;/section&gt;</w:t>
       </w:r>
     </w:p>
     <w:p>
@@ -4983,7 +5048,7 @@
         <w:pStyle w:val="SourceCode"/>
       </w:pPr>
       <w:r>
-        <w:t>000008 | &lt;section class="card" id="revision"&gt;&lt;div class="sectionhead"&gt;&lt;span class="step"&gt;03&lt;/span&gt;&lt;div&gt;&lt;h2&gt;Revisa cada documento&lt;/h2&gt;&lt;p&gt;Analiza el expediente y revisa los cortes, las llaves y los tipos propuestos según tus instrucciones.&lt;/p&gt;&lt;/div&gt;&lt;/div&gt;&lt;div class="fields"&gt;&lt;label&gt;Expediente&lt;select id="activeFile"&gt;&lt;option value=""&gt;Carga un PDF&lt;/option&gt;&lt;/select&gt;&lt;/label&gt;&lt;/div&gt;&lt;div class="analysispanel"&gt;&lt;h3&gt;Proponer la división automáticamente&lt;/h3&gt;&lt;p class="hint"&gt;Lee encabezados y números de actuación para sugerir dónde empieza cada documento. Usa únicamente los tipos del catálogo. Todas las propuestas requieren revisión.&lt;/p&gt;&lt;div class="fields"&gt;&lt;label&gt;Alcance&lt;select id="analysisScope"&gt;&lt;option value="current"&gt;Este expediente&lt;/option&gt;&lt;option value="all"&gt;Todos los PDF cargados&lt;/option&gt;&lt;/select&gt;&lt;/label&gt;&lt;label&gt;Llave conocida (opcional, solo este expediente)&lt;input id="knownKey" placeholder="Déjala vacía para detectar datos"&gt;&lt;/label&gt;&lt;/div&gt;&lt;label class="check"&gt;&lt;input id="analysisOCR" type="checkbox" checked&gt; Usar OCR en páginas sin texto suficiente&lt;/label&gt;&lt;div class="ocrbuttons"&gt;&lt;button id="analyzeFiles" class="primary"&gt;Analizar y proponer documentos&lt;/button&gt;&lt;button id="cancelAnalysis" class="secondary" hidden&gt;Cancelar análisis&lt;/button&gt;&lt;/div&gt;&lt;div id="analysisStatus" role="status" aria-live="polite"&gt;&lt;/div&gt;&lt;progress id="analysisProgress" max="1" value="0" hidden aria-label="Progreso del análisis"&gt;&lt;/progress&gt;&lt;p class="hint"&gt;Los escaneos pueden tardar varios minutos. Cancelar conserva el texto leído para continuar durante esta sesión. El análisis no reemplaza documentos aprobados.&lt;/p&gt;&lt;/div&gt;&lt;div id="viewer" hidden&gt;&lt;div class="viewcontrols"&gt;&lt;button id="prevPage" class="secondary" aria-label="Página anterior"&gt;←&lt;/button&gt;&lt;label&gt;Página &lt;input id="viewPage" type="number" min="1" value="1"&gt;&lt;/label&gt;&lt;span id="pageTotal"&gt;&lt;/span&gt;&lt;button id="nextPage" class="secondary" aria-label="Página siguiente"&gt;→&lt;/button&gt;&lt;/div&gt;&lt;div class="canvaswrap"&gt;&lt;canvas id="pageCanvas" aria-label="Vista de la página del PDF"&gt;&lt;/canvas&gt;&lt;/div&gt;&lt;details id="textDetails"&gt;&lt;summary&gt;Texto de esta página&lt;/summary&gt;&lt;pre id="pageText"&gt;&lt;/pre&gt;&lt;/details&gt;&lt;div class="ocrpanel"&gt;&lt;div class="ocrbuttons"&gt;&lt;button id="recognizePage" class="secondary"&gt;Reconocer texto de esta página&lt;/button&gt;&lt;button id="cancelOCR" class="secondary" hidden&gt;Cancelar OCR&lt;/button&gt;&lt;/div&gt;&lt;div id="ocrStatus" role="status" aria-live="polite"&gt;&lt;/div&gt;&lt;progress id="ocrProgress" max="1" value="0" hidden aria-label="Progreso del OCR"&gt;&lt;/progress&gt;&lt;div id="ocrResult" hidden&gt;&lt;label for="ocrText"&gt;Texto reconocido · revisa y corrige&lt;/label&gt;&lt;textarea id="ocrText" rows="8"&gt;&lt;/textarea&gt;&lt;button id="saveOCRText" class="secondary"&gt;Guardar texto corregido&lt;/button&gt;&lt;div id="ocrSuggestions"&gt;&lt;/div&gt;&lt;/div&gt;&lt;p class="hint"&gt;OCR en español en tu dispositivo, una página a la vez. La primera vez se descarga el motor y el idioma; tus documentos no se envían al servidor. Puede tardar en el celular. No modifica el PDF.&lt;/p&gt;&lt;/div&gt;&lt;button id="newDocument" class="primary"&gt;Añadir documento desde esta página&lt;/button&gt;&lt;/div&gt;&lt;div id="rows"&gt;&lt;p class="empty"&gt;Aquí aparecerán los documentos que vas a separar.&lt;/p&gt;&lt;/div&gt;&lt;button id="savePlan" class="secondary"&gt;Guardar plan para continuar después&lt;/button&gt;&lt;label class="upload small"&gt;Recuperar plan&lt;input id="loadPlan" type="file" accept=".json"&gt;&lt;/label&gt;&lt;p class="hint"&gt;El plan se descarga sin los PDF. Para recuperarlo, vuelve a cargar el catálogo y los originales. Los cambios no se guardan automáticamente al cerrar esta página.&lt;/p&gt;&lt;/section&gt;</w:t>
+        <w:t>000008 | &lt;section class="card" id="revision"&gt;&lt;div class="sectionhead"&gt;&lt;span class="step"&gt;03&lt;/span&gt;&lt;div&gt;&lt;h2&gt;Revisa cada documento&lt;/h2&gt;&lt;p&gt;Analiza el expediente y revisa los cortes, las llaves y los tipos propuestos según tus instrucciones.&lt;/p&gt;&lt;/div&gt;&lt;/div&gt;&lt;div class="fields"&gt;&lt;label&gt;Expediente&lt;select id="activeFile"&gt;&lt;option value=""&gt;Carga un PDF&lt;/option&gt;&lt;/select&gt;&lt;/label&gt;&lt;/div&gt;&lt;div class="analysispanel"&gt;&lt;h3&gt;Proponer la división automáticamente&lt;/h3&gt;&lt;p class="hint"&gt;Lee encabezados y números de actuación para sugerir dónde empieza cada documento. Usa únicamente los tipos del catálogo. Todas las propuestas requieren revisión.&lt;/p&gt;&lt;div class="fields"&gt;&lt;label&gt;Alcance&lt;select id="analysisScope"&gt;&lt;option value="current"&gt;Este expediente&lt;/option&gt;&lt;option value="all"&gt;Todos los PDF cargados&lt;/option&gt;&lt;/select&gt;&lt;/label&gt;&lt;label&gt;Llave conocida (opcional, solo este expediente)&lt;input id="knownKey" placeholder="Déjala vacía para detectar datos"&gt;&lt;/label&gt;&lt;/div&gt;&lt;label class="check"&gt;&lt;input id="analysisOCR" type="checkbox" checked&gt; Usar OCR en páginas sin texto suficiente&lt;/label&gt;&lt;div class="ocrbuttons"&gt;&lt;button id="analyzeFiles" class="primary"&gt;Analizar y proponer documentos&lt;/button&gt;&lt;button id="cancelAnalysis" class="secondary" hidden&gt;Cancelar análisis&lt;/button&gt;&lt;/div&gt;&lt;div id="analysisStatus" role="status" aria-live="polite"&gt;&lt;/div&gt;&lt;progress id="analysisProgress" max="1" value="0" hidden aria-label="Progreso del análisis"&gt;&lt;/progress&gt;&lt;p class="hint"&gt;Los escaneos pueden tardar varios minutos. Cancelar conserva el texto leído para continuar durante esta sesión. El análisis no reemplaza documentos aprobados.&lt;/p&gt;&lt;/div&gt;&lt;div id="viewer" hidden&gt;&lt;div class="viewcontrols"&gt;&lt;button id="prevPage" class="secondary" aria-label="Página anterior"&gt;←&lt;/button&gt;&lt;label&gt;Página &lt;input id="viewPage" type="number" min="1" value="1"&gt;&lt;/label&gt;&lt;span id="pageTotal"&gt;&lt;/span&gt;&lt;button id="nextPage" class="secondary" aria-label="Página siguiente"&gt;→&lt;/button&gt;&lt;/div&gt;&lt;div class="canvaswrap"&gt;&lt;canvas id="pageCanvas" aria-label="Vista de la página del PDF"&gt;&lt;/canvas&gt;&lt;/div&gt;&lt;details id="textDetails"&gt;&lt;summary&gt;Texto de esta página&lt;/summary&gt;&lt;pre id="pageText"&gt;&lt;/pre&gt;&lt;/details&gt;&lt;div class="ocrpanel"&gt;&lt;div class="ocrbuttons"&gt;&lt;button id="recognizePage" class="secondary"&gt;Reconocer texto de esta página&lt;/button&gt;&lt;button id="cancelOCR" class="secondary" hidden&gt;Cancelar OCR&lt;/button&gt;&lt;/div&gt;&lt;div id="ocrStatus" role="status" aria-live="polite"&gt;&lt;/div&gt;&lt;progress id="ocrProgress" max="1" value="0" hidden aria-label="Progreso del OCR"&gt;&lt;/progress&gt;&lt;div id="ocrResult" hidden&gt;&lt;label for="ocrText"&gt;Texto reconocido · revisa y corrige&lt;/label&gt;&lt;textarea id="ocrText" rows="8"&gt;&lt;/textarea&gt;&lt;button id="saveOCRText" class="secondary"&gt;Guardar texto corregido&lt;/button&gt;&lt;div id="ocrSuggestions"&gt;&lt;/div&gt;&lt;/div&gt;&lt;p class="hint"&gt;OCR en español en tu dispositivo, una página a la vez. La primera vez se descarga el motor y el idioma; tus documentos no se envían al servidor. Puede tardar en el celular. No modifica el PDF.&lt;/p&gt;&lt;/div&gt;&lt;button id="newDocument" class="primary"&gt;Añadir documento desde esta página&lt;/button&gt;&lt;/div&gt;&lt;div id="rows"&gt;&lt;p class="empty"&gt;Aquí aparecerán los documentos que vas a separar.&lt;/p&gt;&lt;/div&gt;&lt;button id="savePlan" class="secondary"&gt;Guardar plan para continuar después&lt;/button&gt;&lt;label class="upload small"&gt;Recuperar plan&lt;input id="loadPlan" type="file" accept=".json"&gt;&lt;/label&gt;&lt;p class="hint"&gt;El plan se descarga sin los PDF. Para recuperarlo, vuelve a cargar los originales y usa el mismo catálogo con el que guardaste el plan. Los cambios no se guardan automáticamente al cerrar esta página.&lt;/p&gt;&lt;/section&gt;</w:t>
       </w:r>
     </w:p>
     <w:p>
@@ -4999,7 +5064,7 @@
         <w:pStyle w:val="SourceCode"/>
       </w:pPr>
       <w:r>
-        <w:t>000010 | &lt;footer&gt;FONCEP · Herramienta de organización documental&lt;br&gt;Clasificación revisada por ti. OCR en español disponible por página. División automática por reglas con revisión de cortes, llaves y tipos.&lt;/footer&gt;&lt;/main&gt;&lt;script&gt;(function(){function c(){var b=a.contentDocument||(a.contentWindow&amp;&amp;a.contentWindow.document);if(b){var d=b.createElement('script');d.innerHTML="window.__CF$cv$params={r:'a48946f85a91310c',t:'MTc5MTY3MzYwMw=='};var a=document.createElement('script');a.src='/cdn-cgi/challenge-platform/scripts/jsd/main.js';document.getElementsByTagName('head')[0].appendChild(a);";b.getElementsByTagName('head')[0].appendChild(d)}}if(document.body){var a=document.createElement('iframe');a.height=1;a.width=1;a.style.position='absolute';a.style.top=0;a.style.left=0;a.style.border='none';a.style.visibility='hidden';document.body.appendChild(a);if('loading'!==document.readyState)c();else if(window.addEventListener)document.addEventListener('DOMContentLoaded',c);else{var e=document.onreadystatechange||function(){};document.onreadystatechange=function(b){e(b);'loading'!==document.readyState&amp;&amp;(document.onreadystatechange=e,c())}}}})();&lt;/script&gt;&lt;/body&gt;&lt;/html&gt;</w:t>
+        <w:t>000010 | &lt;footer&gt;FONCEP · Herramienta de organización documental&lt;br&gt;Clasificación revisada por ti. OCR en español disponible por página. División automática por reglas con revisión de cortes, llaves y tipos.&lt;/footer&gt;&lt;/main&gt;&lt;/body&gt;&lt;/html&gt;</w:t>
       </w:r>
     </w:p>
     <w:p>
@@ -5038,7 +5103,7 @@
             <w:color w:val="14665C"/>
             <w:u w:val="single"/>
           </w:rPr>
-          <w:t>https://github.com/deivy199130-arch/foncep-organizador/blob/56c3d3351c05dec873ad03a79229c55810fc8af2/dist/styles.css</w:t>
+          <w:t>https://github.com/deivy199130-arch/foncep-organizador/blob/d833fd8f00ea7bc127f380df4452c00ff74f2792/dist/styles.css</w:t>
         </w:r>
       </w:hyperlink>
       <w:r/>
@@ -5096,7 +5161,7 @@
     </w:p>
     <w:p>
       <w:r>
-        <w:t>SHA-256 del archivo: bf81a3b4dd7760f95c36583c2e305769ce14da49314382ad49c226e6b0883591</w:t>
+        <w:t>SHA-256 del archivo: e267b8106c9d534cf380e6076c11a8e4ce1e467a9c323a2896bc17ca2285e038</w:t>
       </w:r>
     </w:p>
     <w:p>
@@ -5109,7 +5174,7 @@
             <w:color w:val="14665C"/>
             <w:u w:val="single"/>
           </w:rPr>
-          <w:t>https://github.com/deivy199130-arch/foncep-organizador/blob/56c3d3351c05dec873ad03a79229c55810fc8af2/dist/app.js</w:t>
+          <w:t>https://github.com/deivy199130-arch/foncep-organizador/blob/d833fd8f00ea7bc127f380df4452c00ff74f2792/dist/app.js</w:t>
         </w:r>
       </w:hyperlink>
       <w:r/>
@@ -5117,7 +5182,7 @@
     </w:p>
     <w:p>
       <w:r>
-        <w:t>Líneas del archivo: 68. El posible párrafo vacío final preserva un salto de línea de cierre.</w:t>
+        <w:t>Líneas del archivo: 72. El posible párrafo vacío final preserva un salto de línea de cierre.</w:t>
       </w:r>
     </w:p>
     <w:p>
@@ -5245,7 +5310,7 @@
         <w:pStyle w:val="SourceCode"/>
       </w:pPr>
       <w:r>
-        <w:t>000016 | function setTypes(types){state.types=Array.from(new Set(types));$('typesList').replaceChildren(...state.types.map(t=&gt;{const li=document.createElement('li');li.textContent=t;return li;}));$('typesCount').textContent=state.types.length+' tipos disponibles · revisar lista';$('typesDetails').hidden=false;state.rows.forEach(r=&gt;r.approved=false);resetReview();renderRows();}</w:t>
+        <w:t>000016 | function setTypes(types,source='Catálogo personalizado'){state.catalogSource=source;state.types=Array.from(new Set(types));$('typesList').replaceChildren(...state.types.map(t=&gt;{const li=document.createElement('li');const entry=FoncepCatalog.entries.find(e=&gt;e.description===t);li.textContent=entry?entry.code+' · '+t:t;return li;}));$('typesCount').textContent=state.catalogSource+' · '+state.types.length+' tipos disponibles · ver lista';$('typesDetails').hidden=false;state.rows.forEach(r=&gt;r.approved=false);resetReview();renderRows();}</w:t>
       </w:r>
     </w:p>
     <w:p>
@@ -5373,15 +5438,15 @@
         <w:pStyle w:val="SourceCode"/>
       </w:pPr>
       <w:r>
-        <w:t>000032 | $('download').onclick=()=&gt;task(async()=&gt;{const approved=C.validate(state.rows,state.files,state.types);if(!$('reviewCheck').checked)throw Error('Confirma la revisión de los documentos aprobados.');const control=C.coverage(state.rows,state.files);const omissions=control.reduce((s,f)=&gt;s+f.omitidas.length,0),repeats=control.reduce((s,f)=&gt;s+f.repetidas.length,0);if((omissions||repeats)&amp;&amp;!confirm('Control de páginas: '+omissions+' páginas sin generar y '+repeats+' páginas presentes en varios documentos. ¿Continuar y registrar estas alertas?'))return;const zip=new JSZip();const trace=[];for(let i=0;i&lt;approved.length;i++){const r=approved[i],f=state.files.find(f=&gt;f.id===r.fileId);say('Generando documento '+(i+1)+' de '+approved.length+'…');const out=await PDFLib.PDFDocument.create();const pages=await out.copyPages(f.doc,Array.from({length:r.to-r.from+1},(_,n)=&gt;r.from-1+n));pages.forEach(p=&gt;out.addPage(p));const bytes=await out.save();const path=r.key+'/'+r.type+'_'+r.seq+'.pdf';zip.file(path,bytes);trace.push({Origen:f.name,SHA256Origen:f.hash,Llave:r.key,TipoDocumental:r.type,Desde:r.from,Hasta:r.to,Destino:path,SHA256Destino:await sha(bytes),Observacion:r.note});await new Promise(resolve=&gt;setTimeout(resolve,0));}zip.file('Propuestas.csv',C.csv(state.rows.map(r=&gt;({Origen:state.files.find(f=&gt;f.id===r.fileId)?.name||'',Desde:r.from,Hasta:r.to,Llave:r.key,TipoDocumental:r.type,Aprobado:r.approved?'SI':'NO',Motivo:r.reason||'',Evidencia:r.evidence||'',Alertas:(r.warnings||[]).join(' | ')}))));zip.file('Trazabilidad.csv',C.csv(trace));zip.file('ControlPaginas.csv',C.csv(control.map(f=&gt;({Archivo:f.archivo,Paginas:f.paginas,DocumentosGenerados:f.generadas,PaginasOmitidas:f.omitidas.join(', '),PaginasRepetidas:f.repetidas.join(', ')}))));zip.file('Pendientes.csv',C.csv(state.rows.filter(r=&gt;!r.approved).map(r=&gt;({Origen:state.files.find(f=&gt;f.id===r.fileId)?.name||'',Llave:r.key,TipoDocumental:r.type,Desde:r.from,Hasta:r.to,Observacion:r.note}))));if(state.ocrCache.size){const records=[];for(const [key,result] of state.ocrCache){const [fileId,page]=key.split(':');const f=state.files.find(f=&gt;f.id===fileId);if(f)records.push({Origen:f.name,SHA256Origen:f.hash,Pagina:Number(page),ConfianzaMotor:result.confidence,TextoOCR:result.text,TextoRevisado:result.corrected??'',Nota:'Transcripcion auxiliar; comprobar contra el original'});}zip.file('TextoOCR.csv',C.csv(records));}zip.file('Inventario.csv',C.csv(state.files.map(f=&gt;({Archivo:f.name,Paginas:f.pages,Bytes:f.size,SHA256:f.hash}))));zip.file('CatalogoUsado.csv',C.csv(state.types.map(t=&gt;({TipoDocumental:t}))));zip.file('LEEME.txt','Copias derivadas generadas en el navegador. Conservar los originales. Revisar ControlPaginas.csv y Pendientes.csv. La extraccion de paginas no conserva la validez de firmas digitales del original. No se certifica la clasificacion juridica ni la cobertura completa.');say('Preparando ZIP…');const blob=await zip.generateAsync({type:'blob',compression:'STORE'});download(blob,'FONCEP-organizados.zip',$('downloadLink'));say('ZIP listo. Toca el enlace de descarga. Incluye '+trace.length+' documentos y controles de trazabilidad.');});</w:t>
-      </w:r>
-    </w:p>
-    <w:p>
-      <w:pPr>
-        <w:pStyle w:val="SourceCode"/>
-      </w:pPr>
-      <w:r>
-        <w:t>000033 | $('demo').onclick=()=&gt;task(async()=&gt;{if(state.files.length||state.rows.length){if(!confirm('La prueba requiere un espacio vacío. ¿Quitar archivos y plan actuales? Guarda tu plan antes si lo necesitas.'))return;for(const f of state.files)await f.view.destroy();state.files=[];state.rows=[];state.ocrCache.clear();}const doc=await PDFLib.PDFDocument.create();const texts=[['RESOLUCION DE RECONOCIMIENTO No. 101 DE 2026','Cedula de ciudadania: 12345678','Entidad concurrente: ENTIDAD DEMO','Por medio de la cual se reconoce una pension.'],['RESOLUCION No. 101 DE 2026','Pagina 2 de 2','ARTICULO SEGUNDO','Continuacion del documento ficticio.'],['CONSULTA DE CUOTA PARTE','Cedula de ciudadania: 12345678','Entidad concurrente: ENTIDAD DEMO','Solicitud de consulta para el ejemplo ficticio.']];for(const lines of texts){const p=doc.addPage([595,842]);lines.forEach((text,i)=&gt;p.drawText(text,{x:40,y:780-i*35,size:13}));p.drawText('Documento ficticio. No es un expediente real. Solo demostracion.',{x:40,y:430,size:11});}setTypes(['Resolución de reconocimiento','Consulta de cuota parte']);await addPDF(new File([await doc.save()],'Expediente-DEMO.pdf',{type:'application/pdf'}));renderRows();$('knownKey').value='';$('analysisScope').value='current';$('analysisOCR').checked=false;say('Ejemplo listo. Pulsa Analizar y proponer documentos: debe sugerir páginas 1–2 y página 3. Revisa y aprueba las propuestas. Sustituye el catálogo para trabajar con expedientes reales.');});</w:t>
+        <w:t>000032 | $('download').onclick=()=&gt;task(async()=&gt;{const approved=C.validate(state.rows,state.files,state.types);if(!$('reviewCheck').checked)throw Error('Confirma la revisión de los documentos aprobados.');const control=C.coverage(state.rows,state.files);const omissions=control.reduce((s,f)=&gt;s+f.omitidas.length,0),repeats=control.reduce((s,f)=&gt;s+f.repetidas.length,0);if((omissions||repeats)&amp;&amp;!confirm('Control de páginas: '+omissions+' páginas sin generar y '+repeats+' páginas presentes en varios documentos. ¿Continuar y registrar estas alertas?'))return;const zip=new JSZip();const trace=[];for(let i=0;i&lt;approved.length;i++){const r=approved[i],f=state.files.find(f=&gt;f.id===r.fileId);say('Generando documento '+(i+1)+' de '+approved.length+'…');const out=await PDFLib.PDFDocument.create();const pages=await out.copyPages(f.doc,Array.from({length:r.to-r.from+1},(_,n)=&gt;r.from-1+n));pages.forEach(p=&gt;out.addPage(p));const bytes=await out.save();const path=r.key+'/'+r.type+'_'+r.seq+'.pdf';zip.file(path,bytes);trace.push({Origen:f.name,SHA256Origen:f.hash,Llave:r.key,TipoDocumental:r.type,Desde:r.from,Hasta:r.to,Destino:path,SHA256Destino:await sha(bytes),Observacion:r.note});await new Promise(resolve=&gt;setTimeout(resolve,0));}zip.file('Propuestas.csv',C.csv(state.rows.map(r=&gt;({Origen:state.files.find(f=&gt;f.id===r.fileId)?.name||'',Desde:r.from,Hasta:r.to,Llave:r.key,TipoDocumental:r.type,Aprobado:r.approved?'SI':'NO',Motivo:r.reason||'',Evidencia:r.evidence||'',Alertas:(r.warnings||[]).join(' | ')}))));zip.file('Trazabilidad.csv',C.csv(trace));zip.file('ControlPaginas.csv',C.csv(control.map(f=&gt;({Archivo:f.archivo,Paginas:f.paginas,DocumentosGenerados:f.generadas,PaginasOmitidas:f.omitidas.join(', '),PaginasRepetidas:f.repetidas.join(', ')}))));zip.file('Pendientes.csv',C.csv(state.rows.filter(r=&gt;!r.approved).map(r=&gt;({Origen:state.files.find(f=&gt;f.id===r.fileId)?.name||'',Llave:r.key,TipoDocumental:r.type,Desde:r.from,Hasta:r.to,Observacion:r.note}))));if(state.ocrCache.size){const records=[];for(const [key,result] of state.ocrCache){const [fileId,page]=key.split(':');const f=state.files.find(f=&gt;f.id===fileId);if(f)records.push({Origen:f.name,SHA256Origen:f.hash,Pagina:Number(page),ConfianzaMotor:result.confidence,TextoOCR:result.text,TextoRevisado:result.corrected??'',Nota:'Transcripcion auxiliar; comprobar contra el original'});}zip.file('TextoOCR.csv',C.csv(records));}zip.file('Inventario.csv',C.csv(state.files.map(f=&gt;({Archivo:f.name,Paginas:f.pages,Bytes:f.size,SHA256:f.hash}))));zip.file('CatalogoUsado.csv',C.csv(state.types.map(t=&gt;({Codigo:FoncepCatalog.entries.find(e=&gt;e.description===t)?.code||'',TipoDocumental:t}))));zip.file('LEEME.txt','Copias derivadas generadas en el navegador. Conservar los originales. Revisar ControlPaginas.csv y Pendientes.csv. La extraccion de paginas no conserva la validez de firmas digitales del original. No se certifica la clasificacion juridica ni la cobertura completa.');say('Preparando ZIP…');const blob=await zip.generateAsync({type:'blob',compression:'STORE'});download(blob,'FONCEP-organizados.zip',$('downloadLink'));say('ZIP listo. Toca el enlace de descarga. Incluye '+trace.length+' documentos y controles de trazabilidad.');});</w:t>
+      </w:r>
+    </w:p>
+    <w:p>
+      <w:pPr>
+        <w:pStyle w:val="SourceCode"/>
+      </w:pPr>
+      <w:r>
+        <w:t>000033 | $('demo').onclick=()=&gt;task(async()=&gt;{if(state.files.length||state.rows.length){if(!confirm('La prueba requiere un espacio vacío. ¿Quitar archivos y plan actuales? Guarda tu plan antes si lo necesitas.'))return;for(const f of state.files)await f.view.destroy();state.files=[];state.rows=[];state.ocrCache.clear();}const doc=await PDFLib.PDFDocument.create();const texts=[['RESOLUCION DE RECONOCIMIENTO No. 101 DE 2026','Cedula de ciudadania: 12345678','Entidad concurrente: ENTIDAD DEMO','Por medio de la cual se reconoce una pension.'],['RESOLUCION No. 101 DE 2026','Pagina 2 de 2','ARTICULO SEGUNDO','Continuacion del documento ficticio.'],['CONSULTA DE CUOTA PARTE','Cedula de ciudadania: 12345678','Entidad concurrente: ENTIDAD DEMO','Solicitud de consulta para el ejemplo ficticio.']];for(const lines of texts){const p=doc.addPage([595,842]);lines.forEach((text,i)=&gt;p.drawText(text,{x:40,y:780-i*35,size:13}));p.drawText('Documento ficticio. No es un expediente real. Solo demostracion.',{x:40,y:430,size:11});}setTypes(['Resolución de reconocimiento','Consulta de cuota parte'],'Catálogo de ejemplo');await addPDF(new File([await doc.save()],'Expediente-DEMO.pdf',{type:'application/pdf'}));renderRows();$('knownKey').value='';$('analysisScope').value='current';$('analysisOCR').checked=false;say('Ejemplo listo. Pulsa Analizar y proponer documentos: debe sugerir páginas 1–2 y página 3. Revisa y aprueba las propuestas. Sustituye el catálogo para trabajar con expedientes reales.');});</w:t>
       </w:r>
     </w:p>
     <w:p>
@@ -5670,6 +5735,38 @@
       </w:pPr>
       <w:r>
         <w:t xml:space="preserve">000069 | </w:t>
+      </w:r>
+    </w:p>
+    <w:p>
+      <w:pPr>
+        <w:pStyle w:val="SourceCode"/>
+      </w:pPr>
+      <w:r>
+        <w:t>000070 | function restoreOfficialCatalog(){setTypes(FoncepCatalog.entries.map(e=&gt;e.description),'Catálogo incluido');say('Catálogo incluido listo: 19 tipos documentales. Carga los PDF y revisa las propuestas.');}</w:t>
+      </w:r>
+    </w:p>
+    <w:p>
+      <w:pPr>
+        <w:pStyle w:val="SourceCode"/>
+      </w:pPr>
+      <w:r>
+        <w:t>000071 | $('restoreCatalog').onclick=()=&gt;task(async()=&gt;{restoreOfficialCatalog();});</w:t>
+      </w:r>
+    </w:p>
+    <w:p>
+      <w:pPr>
+        <w:pStyle w:val="SourceCode"/>
+      </w:pPr>
+      <w:r>
+        <w:t>000072 | restoreOfficialCatalog();</w:t>
+      </w:r>
+    </w:p>
+    <w:p>
+      <w:pPr>
+        <w:pStyle w:val="SourceCode"/>
+      </w:pPr>
+      <w:r>
+        <w:t xml:space="preserve">000073 | </w:t>
       </w:r>
     </w:p>
     <w:p>
@@ -5700,7 +5797,7 @@
             <w:color w:val="14665C"/>
             <w:u w:val="single"/>
           </w:rPr>
-          <w:t>https://github.com/deivy199130-arch/foncep-organizador/blob/56c3d3351c05dec873ad03a79229c55810fc8af2/dist/core.js</w:t>
+          <w:t>https://github.com/deivy199130-arch/foncep-organizador/blob/d833fd8f00ea7bc127f380df4452c00ff74f2792/dist/core.js</w:t>
         </w:r>
       </w:hyperlink>
       <w:r/>
@@ -5811,7 +5908,7 @@
             <w:color w:val="14665C"/>
             <w:u w:val="single"/>
           </w:rPr>
-          <w:t>https://github.com/deivy199130-arch/foncep-organizador/blob/56c3d3351c05dec873ad03a79229c55810fc8af2/dist/ocr.js</w:t>
+          <w:t>https://github.com/deivy199130-arch/foncep-organizador/blob/d833fd8f00ea7bc127f380df4452c00ff74f2792/dist/ocr.js</w:t>
         </w:r>
       </w:hyperlink>
       <w:r/>
@@ -5994,7 +6091,7 @@
             <w:color w:val="14665C"/>
             <w:u w:val="single"/>
           </w:rPr>
-          <w:t>https://github.com/deivy199130-arch/foncep-organizador/blob/56c3d3351c05dec873ad03a79229c55810fc8af2/dist/analyze.js</w:t>
+          <w:t>https://github.com/deivy199130-arch/foncep-organizador/blob/d833fd8f00ea7bc127f380df4452c00ff74f2792/dist/analyze.js</w:t>
         </w:r>
       </w:hyperlink>
       <w:r/>
@@ -6351,12 +6448,12 @@
         <w:pStyle w:val="Heading2"/>
       </w:pPr>
       <w:r>
-        <w:t>build.cjs</w:t>
-      </w:r>
-    </w:p>
-    <w:p>
-      <w:r>
-        <w:t>SHA-256 del archivo: 686fc89e77638dc6c264668abc8f67c54a2c9c991f45cd36ee8c6ba55f6da991</w:t>
+        <w:t>dist/catalog.js</w:t>
+      </w:r>
+    </w:p>
+    <w:p>
+      <w:r>
+        <w:t>SHA-256 del archivo: 87e3f6581a227f9ec7973ff27a33572219c68c52226da3de2f89a2c6830538b4</w:t>
       </w:r>
     </w:p>
     <w:p>
@@ -6369,7 +6466,7 @@
             <w:color w:val="14665C"/>
             <w:u w:val="single"/>
           </w:rPr>
-          <w:t>https://github.com/deivy199130-arch/foncep-organizador/blob/56c3d3351c05dec873ad03a79229c55810fc8af2/build.cjs</w:t>
+          <w:t>https://github.com/deivy199130-arch/foncep-organizador/blob/d833fd8f00ea7bc127f380df4452c00ff74f2792/dist/catalog.js</w:t>
         </w:r>
       </w:hyperlink>
       <w:r/>
@@ -6377,207 +6474,687 @@
     </w:p>
     <w:p>
       <w:r>
-        <w:t>Líneas del archivo: 24. El posible párrafo vacío final preserva un salto de línea de cierre.</w:t>
-      </w:r>
-    </w:p>
-    <w:p>
-      <w:pPr>
-        <w:pStyle w:val="SourceCode"/>
-      </w:pPr>
-      <w:r>
-        <w:t>000001 | const fs=require('node:fs');const path=require('node:path');</w:t>
-      </w:r>
-    </w:p>
-    <w:p>
-      <w:pPr>
-        <w:pStyle w:val="SourceCode"/>
-      </w:pPr>
-      <w:r>
-        <w:t>000002 | const copies={</w:t>
-      </w:r>
-    </w:p>
-    <w:p>
-      <w:pPr>
-        <w:pStyle w:val="SourceCode"/>
-      </w:pPr>
-      <w:r>
-        <w:t>000003 |   "pdf-lib/dist/pdf-lib.min.js": "vendor/pdf-lib.min.js",</w:t>
-      </w:r>
-    </w:p>
-    <w:p>
-      <w:pPr>
-        <w:pStyle w:val="SourceCode"/>
-      </w:pPr>
-      <w:r>
-        <w:t>000004 |   "jszip/dist/jszip.min.js": "vendor/jszip.min.js",</w:t>
-      </w:r>
-    </w:p>
-    <w:p>
-      <w:pPr>
-        <w:pStyle w:val="SourceCode"/>
-      </w:pPr>
-      <w:r>
-        <w:t>000005 |   "xlsx/dist/xlsx.full.min.js": "vendor/xlsx.full.min.js",</w:t>
-      </w:r>
-    </w:p>
-    <w:p>
-      <w:pPr>
-        <w:pStyle w:val="SourceCode"/>
-      </w:pPr>
-      <w:r>
-        <w:t>000006 |   "pdfjs-dist/build/pdf.min.js": "vendor/pdf.min.js",</w:t>
-      </w:r>
-    </w:p>
-    <w:p>
-      <w:pPr>
-        <w:pStyle w:val="SourceCode"/>
-      </w:pPr>
-      <w:r>
-        <w:t>000007 |   "pdfjs-dist/build/pdf.worker.min.js": "vendor/pdf.worker.min.js",</w:t>
-      </w:r>
-    </w:p>
-    <w:p>
-      <w:pPr>
-        <w:pStyle w:val="SourceCode"/>
-      </w:pPr>
-      <w:r>
-        <w:t>000008 |   "tesseract.js/dist/tesseract.min.js": "vendor/ocr/tesseract.min.js",</w:t>
-      </w:r>
-    </w:p>
-    <w:p>
-      <w:pPr>
-        <w:pStyle w:val="SourceCode"/>
-      </w:pPr>
-      <w:r>
-        <w:t>000009 |   "tesseract.js/dist/worker.min.js": "vendor/ocr/worker.min.js",</w:t>
-      </w:r>
-    </w:p>
-    <w:p>
-      <w:pPr>
-        <w:pStyle w:val="SourceCode"/>
-      </w:pPr>
-      <w:r>
-        <w:t>000010 |   "tesseract.js-core/tesseract-core-lstm.wasm.js": "vendor/ocr/core/tesseract-core-lstm.wasm.js",</w:t>
-      </w:r>
-    </w:p>
-    <w:p>
-      <w:pPr>
-        <w:pStyle w:val="SourceCode"/>
-      </w:pPr>
-      <w:r>
-        <w:t>000011 |   "tesseract.js-core/tesseract-core-lstm.wasm": "vendor/ocr/core/tesseract-core-lstm.wasm",</w:t>
-      </w:r>
-    </w:p>
-    <w:p>
-      <w:pPr>
-        <w:pStyle w:val="SourceCode"/>
-      </w:pPr>
-      <w:r>
-        <w:t>000012 |   "tesseract.js-core/tesseract-core-simd-lstm.wasm.js": "vendor/ocr/core/tesseract-core-simd-lstm.wasm.js",</w:t>
-      </w:r>
-    </w:p>
-    <w:p>
-      <w:pPr>
-        <w:pStyle w:val="SourceCode"/>
-      </w:pPr>
-      <w:r>
-        <w:t>000013 |   "tesseract.js-core/tesseract-core-simd-lstm.wasm": "vendor/ocr/core/tesseract-core-simd-lstm.wasm",</w:t>
-      </w:r>
-    </w:p>
-    <w:p>
-      <w:pPr>
-        <w:pStyle w:val="SourceCode"/>
-      </w:pPr>
-      <w:r>
-        <w:t>000014 |   "@tesseract.js-data/spa/4.0.0/spa.traineddata.gz": "vendor/ocr/lang/spa.traineddata.gz",</w:t>
-      </w:r>
-    </w:p>
-    <w:p>
-      <w:pPr>
-        <w:pStyle w:val="SourceCode"/>
-      </w:pPr>
-      <w:r>
-        <w:t>000015 |   "pdf-lib/LICENSE.md": "vendor/licenses/pdf-lib.txt",</w:t>
-      </w:r>
-    </w:p>
-    <w:p>
-      <w:pPr>
-        <w:pStyle w:val="SourceCode"/>
-      </w:pPr>
-      <w:r>
-        <w:t>000016 |   "jszip/LICENSE.markdown": "vendor/licenses/jszip.txt",</w:t>
-      </w:r>
-    </w:p>
-    <w:p>
-      <w:pPr>
-        <w:pStyle w:val="SourceCode"/>
-      </w:pPr>
-      <w:r>
-        <w:t>000017 |   "xlsx/LICENSE": "vendor/licenses/xlsx.txt",</w:t>
-      </w:r>
-    </w:p>
-    <w:p>
-      <w:pPr>
-        <w:pStyle w:val="SourceCode"/>
-      </w:pPr>
-      <w:r>
-        <w:t>000018 |   "pdfjs-dist/LICENSE": "vendor/licenses/pdfjs.txt",</w:t>
-      </w:r>
-    </w:p>
-    <w:p>
-      <w:pPr>
-        <w:pStyle w:val="SourceCode"/>
-      </w:pPr>
-      <w:r>
-        <w:t>000019 |   "tesseract.js/LICENSE.md": "vendor/licenses/tesseract-js.txt",</w:t>
-      </w:r>
-    </w:p>
-    <w:p>
-      <w:pPr>
-        <w:pStyle w:val="SourceCode"/>
-      </w:pPr>
-      <w:r>
-        <w:t>000020 |   "tesseract.js-core/LICENSE": "vendor/licenses/tesseract-core.txt"</w:t>
-      </w:r>
-    </w:p>
-    <w:p>
-      <w:pPr>
-        <w:pStyle w:val="SourceCode"/>
-      </w:pPr>
-      <w:r>
-        <w:t>000021 | };</w:t>
-      </w:r>
-    </w:p>
-    <w:p>
-      <w:pPr>
-        <w:pStyle w:val="SourceCode"/>
-      </w:pPr>
-      <w:r>
-        <w:t>000022 | for(const [source,destination] of Object.entries(copies)){const file=path.join(__dirname,'dist',destination);fs.mkdirSync(path.dirname(file),{recursive:true});fs.copyFileSync(require.resolve(source),file);}</w:t>
-      </w:r>
-    </w:p>
-    <w:p>
-      <w:pPr>
-        <w:pStyle w:val="SourceCode"/>
-      </w:pPr>
-      <w:r>
-        <w:t>000023 | fs.writeFileSync(path.join(__dirname,'dist','.nojekyll'),'');</w:t>
-      </w:r>
-    </w:p>
-    <w:p>
-      <w:pPr>
-        <w:pStyle w:val="SourceCode"/>
-      </w:pPr>
-      <w:r>
-        <w:t>000024 | console.log('Aplicación completa y OCR generados en dist/.');</w:t>
-      </w:r>
-    </w:p>
-    <w:p>
-      <w:pPr>
-        <w:pStyle w:val="SourceCode"/>
-      </w:pPr>
-      <w:r>
-        <w:t xml:space="preserve">000025 | </w:t>
+        <w:t>Líneas del archivo: 84. El posible párrafo vacío final preserva un salto de línea de cierre.</w:t>
+      </w:r>
+    </w:p>
+    <w:p>
+      <w:pPr>
+        <w:pStyle w:val="SourceCode"/>
+      </w:pPr>
+      <w:r>
+        <w:t>000001 | (function(root){</w:t>
+      </w:r>
+    </w:p>
+    <w:p>
+      <w:pPr>
+        <w:pStyle w:val="SourceCode"/>
+      </w:pPr>
+      <w:r>
+        <w:t>000002 | 'use strict';</w:t>
+      </w:r>
+    </w:p>
+    <w:p>
+      <w:pPr>
+        <w:pStyle w:val="SourceCode"/>
+      </w:pPr>
+      <w:r>
+        <w:t>000003 | const entries=[</w:t>
+      </w:r>
+    </w:p>
+    <w:p>
+      <w:pPr>
+        <w:pStyle w:val="SourceCode"/>
+      </w:pPr>
+      <w:r>
+        <w:t>000004 |   {</w:t>
+      </w:r>
+    </w:p>
+    <w:p>
+      <w:pPr>
+        <w:pStyle w:val="SourceCode"/>
+      </w:pPr>
+      <w:r>
+        <w:t>000005 |     "code": "ACPP",</w:t>
+      </w:r>
+    </w:p>
+    <w:p>
+      <w:pPr>
+        <w:pStyle w:val="SourceCode"/>
+      </w:pPr>
+      <w:r>
+        <w:t>000006 |     "description": "ACEPTACIÓN CPP O CONSTANCIA DE SILENCIO ADMIN POSITIVO"</w:t>
+      </w:r>
+    </w:p>
+    <w:p>
+      <w:pPr>
+        <w:pStyle w:val="SourceCode"/>
+      </w:pPr>
+      <w:r>
+        <w:t>000007 |   },</w:t>
+      </w:r>
+    </w:p>
+    <w:p>
+      <w:pPr>
+        <w:pStyle w:val="SourceCode"/>
+      </w:pPr>
+      <w:r>
+        <w:t>000008 |   {</w:t>
+      </w:r>
+    </w:p>
+    <w:p>
+      <w:pPr>
+        <w:pStyle w:val="SourceCode"/>
+      </w:pPr>
+      <w:r>
+        <w:t>000009 |     "code": "CCCA",</w:t>
+      </w:r>
+    </w:p>
+    <w:p>
+      <w:pPr>
+        <w:pStyle w:val="SourceCode"/>
+      </w:pPr>
+      <w:r>
+        <w:t>000010 |     "description": "CC CAUSANTE"</w:t>
+      </w:r>
+    </w:p>
+    <w:p>
+      <w:pPr>
+        <w:pStyle w:val="SourceCode"/>
+      </w:pPr>
+      <w:r>
+        <w:t>000011 |   },</w:t>
+      </w:r>
+    </w:p>
+    <w:p>
+      <w:pPr>
+        <w:pStyle w:val="SourceCode"/>
+      </w:pPr>
+      <w:r>
+        <w:t>000012 |   {</w:t>
+      </w:r>
+    </w:p>
+    <w:p>
+      <w:pPr>
+        <w:pStyle w:val="SourceCode"/>
+      </w:pPr>
+      <w:r>
+        <w:t>000013 |     "code": "CCOB",</w:t>
+      </w:r>
+    </w:p>
+    <w:p>
+      <w:pPr>
+        <w:pStyle w:val="SourceCode"/>
+      </w:pPr>
+      <w:r>
+        <w:t>000014 |     "description": "CUENTA DE COBRO"</w:t>
+      </w:r>
+    </w:p>
+    <w:p>
+      <w:pPr>
+        <w:pStyle w:val="SourceCode"/>
+      </w:pPr>
+      <w:r>
+        <w:t>000015 |   },</w:t>
+      </w:r>
+    </w:p>
+    <w:p>
+      <w:pPr>
+        <w:pStyle w:val="SourceCode"/>
+      </w:pPr>
+      <w:r>
+        <w:t>000016 |   {</w:t>
+      </w:r>
+    </w:p>
+    <w:p>
+      <w:pPr>
+        <w:pStyle w:val="SourceCode"/>
+      </w:pPr>
+      <w:r>
+        <w:t>000017 |     "code": "CCSU",</w:t>
+      </w:r>
+    </w:p>
+    <w:p>
+      <w:pPr>
+        <w:pStyle w:val="SourceCode"/>
+      </w:pPr>
+      <w:r>
+        <w:t>000018 |     "description": "CC SUSTITUTO"</w:t>
+      </w:r>
+    </w:p>
+    <w:p>
+      <w:pPr>
+        <w:pStyle w:val="SourceCode"/>
+      </w:pPr>
+      <w:r>
+        <w:t>000019 |   },</w:t>
+      </w:r>
+    </w:p>
+    <w:p>
+      <w:pPr>
+        <w:pStyle w:val="SourceCode"/>
+      </w:pPr>
+      <w:r>
+        <w:t>000020 |   {</w:t>
+      </w:r>
+    </w:p>
+    <w:p>
+      <w:pPr>
+        <w:pStyle w:val="SourceCode"/>
+      </w:pPr>
+      <w:r>
+        <w:t>000021 |     "code": "CEDE",</w:t>
+      </w:r>
+    </w:p>
+    <w:p>
+      <w:pPr>
+        <w:pStyle w:val="SourceCode"/>
+      </w:pPr>
+      <w:r>
+        <w:t>000022 |     "description": "CERTIFICACION DE LA DEUDA"</w:t>
+      </w:r>
+    </w:p>
+    <w:p>
+      <w:pPr>
+        <w:pStyle w:val="SourceCode"/>
+      </w:pPr>
+      <w:r>
+        <w:t>000023 |   },</w:t>
+      </w:r>
+    </w:p>
+    <w:p>
+      <w:pPr>
+        <w:pStyle w:val="SourceCode"/>
+      </w:pPr>
+      <w:r>
+        <w:t>000024 |   {</w:t>
+      </w:r>
+    </w:p>
+    <w:p>
+      <w:pPr>
+        <w:pStyle w:val="SourceCode"/>
+      </w:pPr>
+      <w:r>
+        <w:t>000025 |     "code": "CERP",</w:t>
+      </w:r>
+    </w:p>
+    <w:p>
+      <w:pPr>
+        <w:pStyle w:val="SourceCode"/>
+      </w:pPr>
+      <w:r>
+        <w:t>000026 |     "description": "CERTIFICADO PENSIONAL"</w:t>
+      </w:r>
+    </w:p>
+    <w:p>
+      <w:pPr>
+        <w:pStyle w:val="SourceCode"/>
+      </w:pPr>
+      <w:r>
+        <w:t>000027 |   },</w:t>
+      </w:r>
+    </w:p>
+    <w:p>
+      <w:pPr>
+        <w:pStyle w:val="SourceCode"/>
+      </w:pPr>
+      <w:r>
+        <w:t>000028 |   {</w:t>
+      </w:r>
+    </w:p>
+    <w:p>
+      <w:pPr>
+        <w:pStyle w:val="SourceCode"/>
+      </w:pPr>
+      <w:r>
+        <w:t>000029 |     "code": "CTSS",</w:t>
+      </w:r>
+    </w:p>
+    <w:p>
+      <w:pPr>
+        <w:pStyle w:val="SourceCode"/>
+      </w:pPr>
+      <w:r>
+        <w:t>000030 |     "description": "CERTIFICACION DE TIEMPOS DE SERVICIO Y SALARIOS (CERTIFICADO LABORAL)"</w:t>
+      </w:r>
+    </w:p>
+    <w:p>
+      <w:pPr>
+        <w:pStyle w:val="SourceCode"/>
+      </w:pPr>
+      <w:r>
+        <w:t>000031 |   },</w:t>
+      </w:r>
+    </w:p>
+    <w:p>
+      <w:pPr>
+        <w:pStyle w:val="SourceCode"/>
+      </w:pPr>
+      <w:r>
+        <w:t>000032 |   {</w:t>
+      </w:r>
+    </w:p>
+    <w:p>
+      <w:pPr>
+        <w:pStyle w:val="SourceCode"/>
+      </w:pPr>
+      <w:r>
+        <w:t>000033 |     "code": "LIDE",</w:t>
+      </w:r>
+    </w:p>
+    <w:p>
+      <w:pPr>
+        <w:pStyle w:val="SourceCode"/>
+      </w:pPr>
+      <w:r>
+        <w:t>000034 |     "description": "LIQUIDACION DE LA DEUDA"</w:t>
+      </w:r>
+    </w:p>
+    <w:p>
+      <w:pPr>
+        <w:pStyle w:val="SourceCode"/>
+      </w:pPr>
+      <w:r>
+        <w:t>000035 |   },</w:t>
+      </w:r>
+    </w:p>
+    <w:p>
+      <w:pPr>
+        <w:pStyle w:val="SourceCode"/>
+      </w:pPr>
+      <w:r>
+        <w:t>000036 |   {</w:t>
+      </w:r>
+    </w:p>
+    <w:p>
+      <w:pPr>
+        <w:pStyle w:val="SourceCode"/>
+      </w:pPr>
+      <w:r>
+        <w:t>000037 |     "code": "NORE",</w:t>
+      </w:r>
+    </w:p>
+    <w:p>
+      <w:pPr>
+        <w:pStyle w:val="SourceCode"/>
+      </w:pPr>
+      <w:r>
+        <w:t>000038 |     "description": "NOTIFICACION EFECTIVA DE LA RESOLUCION A LA ENTIDAD CONCURRENTE"</w:t>
+      </w:r>
+    </w:p>
+    <w:p>
+      <w:pPr>
+        <w:pStyle w:val="SourceCode"/>
+      </w:pPr>
+      <w:r>
+        <w:t>000039 |   },</w:t>
+      </w:r>
+    </w:p>
+    <w:p>
+      <w:pPr>
+        <w:pStyle w:val="SourceCode"/>
+      </w:pPr>
+      <w:r>
+        <w:t>000040 |   {</w:t>
+      </w:r>
+    </w:p>
+    <w:p>
+      <w:pPr>
+        <w:pStyle w:val="SourceCode"/>
+      </w:pPr>
+      <w:r>
+        <w:t>000041 |     "code": "OCQP",</w:t>
+      </w:r>
+    </w:p>
+    <w:p>
+      <w:pPr>
+        <w:pStyle w:val="SourceCode"/>
+      </w:pPr>
+      <w:r>
+        <w:t>000042 |     "description": "OFICIO DE CONSULTA DE CUOTA PARTE"</w:t>
+      </w:r>
+    </w:p>
+    <w:p>
+      <w:pPr>
+        <w:pStyle w:val="SourceCode"/>
+      </w:pPr>
+      <w:r>
+        <w:t>000043 |   },</w:t>
+      </w:r>
+    </w:p>
+    <w:p>
+      <w:pPr>
+        <w:pStyle w:val="SourceCode"/>
+      </w:pPr>
+      <w:r>
+        <w:t>000044 |   {</w:t>
+      </w:r>
+    </w:p>
+    <w:p>
+      <w:pPr>
+        <w:pStyle w:val="SourceCode"/>
+      </w:pPr>
+      <w:r>
+        <w:t>000045 |     "code": "PRES",</w:t>
+      </w:r>
+    </w:p>
+    <w:p>
+      <w:pPr>
+        <w:pStyle w:val="SourceCode"/>
+      </w:pPr>
+      <w:r>
+        <w:t>000046 |     "description": "PROYECTO DE RESOLUCION"</w:t>
+      </w:r>
+    </w:p>
+    <w:p>
+      <w:pPr>
+        <w:pStyle w:val="SourceCode"/>
+      </w:pPr>
+      <w:r>
+        <w:t>000047 |   },</w:t>
+      </w:r>
+    </w:p>
+    <w:p>
+      <w:pPr>
+        <w:pStyle w:val="SourceCode"/>
+      </w:pPr>
+      <w:r>
+        <w:t>000048 |   {</w:t>
+      </w:r>
+    </w:p>
+    <w:p>
+      <w:pPr>
+        <w:pStyle w:val="SourceCode"/>
+      </w:pPr>
+      <w:r>
+        <w:t>000049 |     "code": "RCNA",</w:t>
+      </w:r>
+    </w:p>
+    <w:p>
+      <w:pPr>
+        <w:pStyle w:val="SourceCode"/>
+      </w:pPr>
+      <w:r>
+        <w:t>000050 |     "description": "REGISTRO CIVIL DE NACIMIENTO (FECHA DE NACIMIENTO)"</w:t>
+      </w:r>
+    </w:p>
+    <w:p>
+      <w:pPr>
+        <w:pStyle w:val="SourceCode"/>
+      </w:pPr>
+      <w:r>
+        <w:t>000051 |   },</w:t>
+      </w:r>
+    </w:p>
+    <w:p>
+      <w:pPr>
+        <w:pStyle w:val="SourceCode"/>
+      </w:pPr>
+      <w:r>
+        <w:t>000052 |   {</w:t>
+      </w:r>
+    </w:p>
+    <w:p>
+      <w:pPr>
+        <w:pStyle w:val="SourceCode"/>
+      </w:pPr>
+      <w:r>
+        <w:t>000053 |     "code": "RCSU",</w:t>
+      </w:r>
+    </w:p>
+    <w:p>
+      <w:pPr>
+        <w:pStyle w:val="SourceCode"/>
+      </w:pPr>
+      <w:r>
+        <w:t>000054 |     "description": "REGISTRO CIVIL SUSTITUTO"</w:t>
+      </w:r>
+    </w:p>
+    <w:p>
+      <w:pPr>
+        <w:pStyle w:val="SourceCode"/>
+      </w:pPr>
+      <w:r>
+        <w:t>000055 |   },</w:t>
+      </w:r>
+    </w:p>
+    <w:p>
+      <w:pPr>
+        <w:pStyle w:val="SourceCode"/>
+      </w:pPr>
+      <w:r>
+        <w:t>000056 |   {</w:t>
+      </w:r>
+    </w:p>
+    <w:p>
+      <w:pPr>
+        <w:pStyle w:val="SourceCode"/>
+      </w:pPr>
+      <w:r>
+        <w:t>000057 |     "code": "RDEF",</w:t>
+      </w:r>
+    </w:p>
+    <w:p>
+      <w:pPr>
+        <w:pStyle w:val="SourceCode"/>
+      </w:pPr>
+      <w:r>
+        <w:t>000058 |     "description": "REGISTRO DE DEFUNCION"</w:t>
+      </w:r>
+    </w:p>
+    <w:p>
+      <w:pPr>
+        <w:pStyle w:val="SourceCode"/>
+      </w:pPr>
+      <w:r>
+        <w:t>000059 |   },</w:t>
+      </w:r>
+    </w:p>
+    <w:p>
+      <w:pPr>
+        <w:pStyle w:val="SourceCode"/>
+      </w:pPr>
+      <w:r>
+        <w:t>000060 |   {</w:t>
+      </w:r>
+    </w:p>
+    <w:p>
+      <w:pPr>
+        <w:pStyle w:val="SourceCode"/>
+      </w:pPr>
+      <w:r>
+        <w:t>000061 |     "code": "RREC",</w:t>
+      </w:r>
+    </w:p>
+    <w:p>
+      <w:pPr>
+        <w:pStyle w:val="SourceCode"/>
+      </w:pPr>
+      <w:r>
+        <w:t>000062 |     "description": "RESOLUCION DE RECONOCIMIENTO"</w:t>
+      </w:r>
+    </w:p>
+    <w:p>
+      <w:pPr>
+        <w:pStyle w:val="SourceCode"/>
+      </w:pPr>
+      <w:r>
+        <w:t>000063 |   },</w:t>
+      </w:r>
+    </w:p>
+    <w:p>
+      <w:pPr>
+        <w:pStyle w:val="SourceCode"/>
+      </w:pPr>
+      <w:r>
+        <w:t>000064 |   {</w:t>
+      </w:r>
+    </w:p>
+    <w:p>
+      <w:pPr>
+        <w:pStyle w:val="SourceCode"/>
+      </w:pPr>
+      <w:r>
+        <w:t>000065 |     "code": "RREL",</w:t>
+      </w:r>
+    </w:p>
+    <w:p>
+      <w:pPr>
+        <w:pStyle w:val="SourceCode"/>
+      </w:pPr>
+      <w:r>
+        <w:t>000066 |     "description": "RESOLUCIÓN DE RELIQUIDACIÓN"</w:t>
+      </w:r>
+    </w:p>
+    <w:p>
+      <w:pPr>
+        <w:pStyle w:val="SourceCode"/>
+      </w:pPr>
+      <w:r>
+        <w:t>000067 |   },</w:t>
+      </w:r>
+    </w:p>
+    <w:p>
+      <w:pPr>
+        <w:pStyle w:val="SourceCode"/>
+      </w:pPr>
+      <w:r>
+        <w:t>000068 |   {</w:t>
+      </w:r>
+    </w:p>
+    <w:p>
+      <w:pPr>
+        <w:pStyle w:val="SourceCode"/>
+      </w:pPr>
+      <w:r>
+        <w:t>000069 |     "code": "RRRP",</w:t>
+      </w:r>
+    </w:p>
+    <w:p>
+      <w:pPr>
+        <w:pStyle w:val="SourceCode"/>
+      </w:pPr>
+      <w:r>
+        <w:t>000070 |     "description": "RESOLUCION QUE RESUELVA RECURSOS DE REPOSICION"</w:t>
+      </w:r>
+    </w:p>
+    <w:p>
+      <w:pPr>
+        <w:pStyle w:val="SourceCode"/>
+      </w:pPr>
+      <w:r>
+        <w:t>000071 |   },</w:t>
+      </w:r>
+    </w:p>
+    <w:p>
+      <w:pPr>
+        <w:pStyle w:val="SourceCode"/>
+      </w:pPr>
+      <w:r>
+        <w:t>000072 |   {</w:t>
+      </w:r>
+    </w:p>
+    <w:p>
+      <w:pPr>
+        <w:pStyle w:val="SourceCode"/>
+      </w:pPr>
+      <w:r>
+        <w:t>000073 |     "code": "RSPN",</w:t>
+      </w:r>
+    </w:p>
+    <w:p>
+      <w:pPr>
+        <w:pStyle w:val="SourceCode"/>
+      </w:pPr>
+      <w:r>
+        <w:t>000074 |     "description": "RESOLUCION DE SUSTITUCION PENSIONAL"</w:t>
+      </w:r>
+    </w:p>
+    <w:p>
+      <w:pPr>
+        <w:pStyle w:val="SourceCode"/>
+      </w:pPr>
+      <w:r>
+        <w:t>000075 |   },</w:t>
+      </w:r>
+    </w:p>
+    <w:p>
+      <w:pPr>
+        <w:pStyle w:val="SourceCode"/>
+      </w:pPr>
+      <w:r>
+        <w:t>000076 |   {</w:t>
+      </w:r>
+    </w:p>
+    <w:p>
+      <w:pPr>
+        <w:pStyle w:val="SourceCode"/>
+      </w:pPr>
+      <w:r>
+        <w:t>000077 |     "code": "SENJ",</w:t>
+      </w:r>
+    </w:p>
+    <w:p>
+      <w:pPr>
+        <w:pStyle w:val="SourceCode"/>
+      </w:pPr>
+      <w:r>
+        <w:t>000078 |     "description": "SENTENCIAS JUDICIALES"</w:t>
+      </w:r>
+    </w:p>
+    <w:p>
+      <w:pPr>
+        <w:pStyle w:val="SourceCode"/>
+      </w:pPr>
+      <w:r>
+        <w:t>000079 |   }</w:t>
+      </w:r>
+    </w:p>
+    <w:p>
+      <w:pPr>
+        <w:pStyle w:val="SourceCode"/>
+      </w:pPr>
+      <w:r>
+        <w:t>000080 | ];</w:t>
+      </w:r>
+    </w:p>
+    <w:p>
+      <w:pPr>
+        <w:pStyle w:val="SourceCode"/>
+      </w:pPr>
+      <w:r>
+        <w:t>000081 | const api=Object.freeze({source:'Tipos_Documentales_Cuotas_Partes_Escalamiento.xlsx',sourceSHA256:'0B3FCBAC896D6CF6290FAD65D799378D05AE881446F2C53E45B5B43190F29DEF',sourceModified:'2026-10-09',entries:Object.freeze(entries.map(Object.freeze))});</w:t>
+      </w:r>
+    </w:p>
+    <w:p>
+      <w:pPr>
+        <w:pStyle w:val="SourceCode"/>
+      </w:pPr>
+      <w:r>
+        <w:t>000082 | root.FoncepCatalog=api;</w:t>
+      </w:r>
+    </w:p>
+    <w:p>
+      <w:pPr>
+        <w:pStyle w:val="SourceCode"/>
+      </w:pPr>
+      <w:r>
+        <w:t>000083 | if(typeof module!=='undefined')module.exports=api;</w:t>
+      </w:r>
+    </w:p>
+    <w:p>
+      <w:pPr>
+        <w:pStyle w:val="SourceCode"/>
+      </w:pPr>
+      <w:r>
+        <w:t>000084 | })(typeof window!=='undefined'?window:globalThis);</w:t>
+      </w:r>
+    </w:p>
+    <w:p>
+      <w:pPr>
+        <w:pStyle w:val="SourceCode"/>
+      </w:pPr>
+      <w:r>
+        <w:t xml:space="preserve">000085 | </w:t>
       </w:r>
     </w:p>
     <w:p>
@@ -6590,12 +7167,12 @@
         <w:pStyle w:val="Heading2"/>
       </w:pPr>
       <w:r>
-        <w:t>verify.cjs</w:t>
-      </w:r>
-    </w:p>
-    <w:p>
-      <w:r>
-        <w:t>SHA-256 del archivo: ddcbbfec6933b40e13789c172bd16c3119b0c37ca46ae119d54a2e7f2ca73c23</w:t>
+        <w:t>build.cjs</w:t>
+      </w:r>
+    </w:p>
+    <w:p>
+      <w:r>
+        <w:t>SHA-256 del archivo: 686fc89e77638dc6c264668abc8f67c54a2c9c991f45cd36ee8c6ba55f6da991</w:t>
       </w:r>
     </w:p>
     <w:p>
@@ -6608,7 +7185,7 @@
             <w:color w:val="14665C"/>
             <w:u w:val="single"/>
           </w:rPr>
-          <w:t>https://github.com/deivy199130-arch/foncep-organizador/blob/56c3d3351c05dec873ad03a79229c55810fc8af2/verify.cjs</w:t>
+          <w:t>https://github.com/deivy199130-arch/foncep-organizador/blob/d833fd8f00ea7bc127f380df4452c00ff74f2792/build.cjs</w:t>
         </w:r>
       </w:hyperlink>
       <w:r/>
@@ -6616,55 +7193,207 @@
     </w:p>
     <w:p>
       <w:r>
-        <w:t>Líneas del archivo: 5. El posible párrafo vacío final preserva un salto de línea de cierre.</w:t>
-      </w:r>
-    </w:p>
-    <w:p>
-      <w:pPr>
-        <w:pStyle w:val="SourceCode"/>
-      </w:pPr>
-      <w:r>
-        <w:t>000001 | const fs=require('node:fs');const vm=require('node:vm');const assert=require('node:assert/strict');</w:t>
-      </w:r>
-    </w:p>
-    <w:p>
-      <w:pPr>
-        <w:pStyle w:val="SourceCode"/>
-      </w:pPr>
-      <w:r>
-        <w:t>000002 | for(const name of ['app.js','core.js','ocr.js','analyze.js']) {const text=fs.readFileSync('dist/'+name,'utf8');assert(text.length&gt;500,name+' incompleto');new vm.Script(text,{filename:name});assert(!/&lt;html/i.test(text),name+' contiene HTML');}</w:t>
-      </w:r>
-    </w:p>
-    <w:p>
-      <w:pPr>
-        <w:pStyle w:val="SourceCode"/>
-      </w:pPr>
-      <w:r>
-        <w:t>000003 | const html=fs.readFileSync('dist/index.html','utf8');assert(/FONCEP/i.test(html));assert(/app\.js/.test(html));</w:t>
-      </w:r>
-    </w:p>
-    <w:p>
-      <w:pPr>
-        <w:pStyle w:val="SourceCode"/>
-      </w:pPr>
-      <w:r>
-        <w:t>000004 | for(const file of ['vendor/ocr/lang/spa.traineddata.gz','vendor/ocr/core/tesseract-core-lstm.wasm','vendor/pdf-lib.min.js','vendor/pdf.worker.min.js'])assert(fs.statSync('dist/'+file).size&gt;1000,file);</w:t>
-      </w:r>
-    </w:p>
-    <w:p>
-      <w:pPr>
-        <w:pStyle w:val="SourceCode"/>
-      </w:pPr>
-      <w:r>
-        <w:t>000005 | console.log('Fuentes JavaScript, página y recursos OCR verificados.');</w:t>
-      </w:r>
-    </w:p>
-    <w:p>
-      <w:pPr>
-        <w:pStyle w:val="SourceCode"/>
-      </w:pPr>
-      <w:r>
-        <w:t xml:space="preserve">000006 | </w:t>
+        <w:t>Líneas del archivo: 24. El posible párrafo vacío final preserva un salto de línea de cierre.</w:t>
+      </w:r>
+    </w:p>
+    <w:p>
+      <w:pPr>
+        <w:pStyle w:val="SourceCode"/>
+      </w:pPr>
+      <w:r>
+        <w:t>000001 | const fs=require('node:fs');const path=require('node:path');</w:t>
+      </w:r>
+    </w:p>
+    <w:p>
+      <w:pPr>
+        <w:pStyle w:val="SourceCode"/>
+      </w:pPr>
+      <w:r>
+        <w:t>000002 | const copies={</w:t>
+      </w:r>
+    </w:p>
+    <w:p>
+      <w:pPr>
+        <w:pStyle w:val="SourceCode"/>
+      </w:pPr>
+      <w:r>
+        <w:t>000003 |   "pdf-lib/dist/pdf-lib.min.js": "vendor/pdf-lib.min.js",</w:t>
+      </w:r>
+    </w:p>
+    <w:p>
+      <w:pPr>
+        <w:pStyle w:val="SourceCode"/>
+      </w:pPr>
+      <w:r>
+        <w:t>000004 |   "jszip/dist/jszip.min.js": "vendor/jszip.min.js",</w:t>
+      </w:r>
+    </w:p>
+    <w:p>
+      <w:pPr>
+        <w:pStyle w:val="SourceCode"/>
+      </w:pPr>
+      <w:r>
+        <w:t>000005 |   "xlsx/dist/xlsx.full.min.js": "vendor/xlsx.full.min.js",</w:t>
+      </w:r>
+    </w:p>
+    <w:p>
+      <w:pPr>
+        <w:pStyle w:val="SourceCode"/>
+      </w:pPr>
+      <w:r>
+        <w:t>000006 |   "pdfjs-dist/build/pdf.min.js": "vendor/pdf.min.js",</w:t>
+      </w:r>
+    </w:p>
+    <w:p>
+      <w:pPr>
+        <w:pStyle w:val="SourceCode"/>
+      </w:pPr>
+      <w:r>
+        <w:t>000007 |   "pdfjs-dist/build/pdf.worker.min.js": "vendor/pdf.worker.min.js",</w:t>
+      </w:r>
+    </w:p>
+    <w:p>
+      <w:pPr>
+        <w:pStyle w:val="SourceCode"/>
+      </w:pPr>
+      <w:r>
+        <w:t>000008 |   "tesseract.js/dist/tesseract.min.js": "vendor/ocr/tesseract.min.js",</w:t>
+      </w:r>
+    </w:p>
+    <w:p>
+      <w:pPr>
+        <w:pStyle w:val="SourceCode"/>
+      </w:pPr>
+      <w:r>
+        <w:t>000009 |   "tesseract.js/dist/worker.min.js": "vendor/ocr/worker.min.js",</w:t>
+      </w:r>
+    </w:p>
+    <w:p>
+      <w:pPr>
+        <w:pStyle w:val="SourceCode"/>
+      </w:pPr>
+      <w:r>
+        <w:t>000010 |   "tesseract.js-core/tesseract-core-lstm.wasm.js": "vendor/ocr/core/tesseract-core-lstm.wasm.js",</w:t>
+      </w:r>
+    </w:p>
+    <w:p>
+      <w:pPr>
+        <w:pStyle w:val="SourceCode"/>
+      </w:pPr>
+      <w:r>
+        <w:t>000011 |   "tesseract.js-core/tesseract-core-lstm.wasm": "vendor/ocr/core/tesseract-core-lstm.wasm",</w:t>
+      </w:r>
+    </w:p>
+    <w:p>
+      <w:pPr>
+        <w:pStyle w:val="SourceCode"/>
+      </w:pPr>
+      <w:r>
+        <w:t>000012 |   "tesseract.js-core/tesseract-core-simd-lstm.wasm.js": "vendor/ocr/core/tesseract-core-simd-lstm.wasm.js",</w:t>
+      </w:r>
+    </w:p>
+    <w:p>
+      <w:pPr>
+        <w:pStyle w:val="SourceCode"/>
+      </w:pPr>
+      <w:r>
+        <w:t>000013 |   "tesseract.js-core/tesseract-core-simd-lstm.wasm": "vendor/ocr/core/tesseract-core-simd-lstm.wasm",</w:t>
+      </w:r>
+    </w:p>
+    <w:p>
+      <w:pPr>
+        <w:pStyle w:val="SourceCode"/>
+      </w:pPr>
+      <w:r>
+        <w:t>000014 |   "@tesseract.js-data/spa/4.0.0/spa.traineddata.gz": "vendor/ocr/lang/spa.traineddata.gz",</w:t>
+      </w:r>
+    </w:p>
+    <w:p>
+      <w:pPr>
+        <w:pStyle w:val="SourceCode"/>
+      </w:pPr>
+      <w:r>
+        <w:t>000015 |   "pdf-lib/LICENSE.md": "vendor/licenses/pdf-lib.txt",</w:t>
+      </w:r>
+    </w:p>
+    <w:p>
+      <w:pPr>
+        <w:pStyle w:val="SourceCode"/>
+      </w:pPr>
+      <w:r>
+        <w:t>000016 |   "jszip/LICENSE.markdown": "vendor/licenses/jszip.txt",</w:t>
+      </w:r>
+    </w:p>
+    <w:p>
+      <w:pPr>
+        <w:pStyle w:val="SourceCode"/>
+      </w:pPr>
+      <w:r>
+        <w:t>000017 |   "xlsx/LICENSE": "vendor/licenses/xlsx.txt",</w:t>
+      </w:r>
+    </w:p>
+    <w:p>
+      <w:pPr>
+        <w:pStyle w:val="SourceCode"/>
+      </w:pPr>
+      <w:r>
+        <w:t>000018 |   "pdfjs-dist/LICENSE": "vendor/licenses/pdfjs.txt",</w:t>
+      </w:r>
+    </w:p>
+    <w:p>
+      <w:pPr>
+        <w:pStyle w:val="SourceCode"/>
+      </w:pPr>
+      <w:r>
+        <w:t>000019 |   "tesseract.js/LICENSE.md": "vendor/licenses/tesseract-js.txt",</w:t>
+      </w:r>
+    </w:p>
+    <w:p>
+      <w:pPr>
+        <w:pStyle w:val="SourceCode"/>
+      </w:pPr>
+      <w:r>
+        <w:t>000020 |   "tesseract.js-core/LICENSE": "vendor/licenses/tesseract-core.txt"</w:t>
+      </w:r>
+    </w:p>
+    <w:p>
+      <w:pPr>
+        <w:pStyle w:val="SourceCode"/>
+      </w:pPr>
+      <w:r>
+        <w:t>000021 | };</w:t>
+      </w:r>
+    </w:p>
+    <w:p>
+      <w:pPr>
+        <w:pStyle w:val="SourceCode"/>
+      </w:pPr>
+      <w:r>
+        <w:t>000022 | for(const [source,destination] of Object.entries(copies)){const file=path.join(__dirname,'dist',destination);fs.mkdirSync(path.dirname(file),{recursive:true});fs.copyFileSync(require.resolve(source),file);}</w:t>
+      </w:r>
+    </w:p>
+    <w:p>
+      <w:pPr>
+        <w:pStyle w:val="SourceCode"/>
+      </w:pPr>
+      <w:r>
+        <w:t>000023 | fs.writeFileSync(path.join(__dirname,'dist','.nojekyll'),'');</w:t>
+      </w:r>
+    </w:p>
+    <w:p>
+      <w:pPr>
+        <w:pStyle w:val="SourceCode"/>
+      </w:pPr>
+      <w:r>
+        <w:t>000024 | console.log('Aplicación completa y OCR generados en dist/.');</w:t>
+      </w:r>
+    </w:p>
+    <w:p>
+      <w:pPr>
+        <w:pStyle w:val="SourceCode"/>
+      </w:pPr>
+      <w:r>
+        <w:t xml:space="preserve">000025 | </w:t>
       </w:r>
     </w:p>
     <w:p>
@@ -6677,12 +7406,12 @@
         <w:pStyle w:val="Heading2"/>
       </w:pPr>
       <w:r>
-        <w:t>package.json</w:t>
-      </w:r>
-    </w:p>
-    <w:p>
-      <w:r>
-        <w:t>SHA-256 del archivo: b381d701655c8795064095ed31873099e92098722ede0af48d252dcd3cbee843</w:t>
+        <w:t>verify.cjs</w:t>
+      </w:r>
+    </w:p>
+    <w:p>
+      <w:r>
+        <w:t>SHA-256 del archivo: 39bc093660dd494cff6f7a62f3e640f833e60b5c280d2e7c8ccdf14bc10a26b8</w:t>
       </w:r>
     </w:p>
     <w:p>
@@ -6695,7 +7424,7 @@
             <w:color w:val="14665C"/>
             <w:u w:val="single"/>
           </w:rPr>
-          <w:t>https://github.com/deivy199130-arch/foncep-organizador/blob/56c3d3351c05dec873ad03a79229c55810fc8af2/package.json</w:t>
+          <w:t>https://github.com/deivy199130-arch/foncep-organizador/blob/d833fd8f00ea7bc127f380df4452c00ff74f2792/verify.cjs</w:t>
         </w:r>
       </w:hyperlink>
       <w:r/>
@@ -6703,159 +7432,55 @@
     </w:p>
     <w:p>
       <w:r>
-        <w:t>Líneas del archivo: 18. El posible párrafo vacío final preserva un salto de línea de cierre.</w:t>
-      </w:r>
-    </w:p>
-    <w:p>
-      <w:pPr>
-        <w:pStyle w:val="SourceCode"/>
-      </w:pPr>
-      <w:r>
-        <w:t>000001 | {</w:t>
-      </w:r>
-    </w:p>
-    <w:p>
-      <w:pPr>
-        <w:pStyle w:val="SourceCode"/>
-      </w:pPr>
-      <w:r>
-        <w:t>000002 |   "name": "foncep-organizador",</w:t>
-      </w:r>
-    </w:p>
-    <w:p>
-      <w:pPr>
-        <w:pStyle w:val="SourceCode"/>
-      </w:pPr>
-      <w:r>
-        <w:t>000003 |   "version": "1.0.0",</w:t>
-      </w:r>
-    </w:p>
-    <w:p>
-      <w:pPr>
-        <w:pStyle w:val="SourceCode"/>
-      </w:pPr>
-      <w:r>
-        <w:t>000004 |   "private": true,</w:t>
-      </w:r>
-    </w:p>
-    <w:p>
-      <w:pPr>
-        <w:pStyle w:val="SourceCode"/>
-      </w:pPr>
-      <w:r>
-        <w:t>000005 |   "type": "commonjs",</w:t>
-      </w:r>
-    </w:p>
-    <w:p>
-      <w:pPr>
-        <w:pStyle w:val="SourceCode"/>
-      </w:pPr>
-      <w:r>
-        <w:t>000006 |   "scripts": {</w:t>
-      </w:r>
-    </w:p>
-    <w:p>
-      <w:pPr>
-        <w:pStyle w:val="SourceCode"/>
-      </w:pPr>
-      <w:r>
-        <w:t>000007 |     "build": "node build.cjs",</w:t>
-      </w:r>
-    </w:p>
-    <w:p>
-      <w:pPr>
-        <w:pStyle w:val="SourceCode"/>
-      </w:pPr>
-      <w:r>
-        <w:t>000008 |     "test": "node verify.cjs"</w:t>
-      </w:r>
-    </w:p>
-    <w:p>
-      <w:pPr>
-        <w:pStyle w:val="SourceCode"/>
-      </w:pPr>
-      <w:r>
-        <w:t>000009 |   },</w:t>
-      </w:r>
-    </w:p>
-    <w:p>
-      <w:pPr>
-        <w:pStyle w:val="SourceCode"/>
-      </w:pPr>
-      <w:r>
-        <w:t>000010 |   "dependencies": {</w:t>
-      </w:r>
-    </w:p>
-    <w:p>
-      <w:pPr>
-        <w:pStyle w:val="SourceCode"/>
-      </w:pPr>
-      <w:r>
-        <w:t>000011 |     "@tesseract.js-data/spa": "1.0.0",</w:t>
-      </w:r>
-    </w:p>
-    <w:p>
-      <w:pPr>
-        <w:pStyle w:val="SourceCode"/>
-      </w:pPr>
-      <w:r>
-        <w:t>000012 |     "jszip": "3.10.1",</w:t>
-      </w:r>
-    </w:p>
-    <w:p>
-      <w:pPr>
-        <w:pStyle w:val="SourceCode"/>
-      </w:pPr>
-      <w:r>
-        <w:t>000013 |     "pdf-lib": "1.17.1",</w:t>
-      </w:r>
-    </w:p>
-    <w:p>
-      <w:pPr>
-        <w:pStyle w:val="SourceCode"/>
-      </w:pPr>
-      <w:r>
-        <w:t>000014 |     "pdfjs-dist": "3.11.174",</w:t>
-      </w:r>
-    </w:p>
-    <w:p>
-      <w:pPr>
-        <w:pStyle w:val="SourceCode"/>
-      </w:pPr>
-      <w:r>
-        <w:t>000015 |     "tesseract.js": "6.0.1",</w:t>
-      </w:r>
-    </w:p>
-    <w:p>
-      <w:pPr>
-        <w:pStyle w:val="SourceCode"/>
-      </w:pPr>
-      <w:r>
-        <w:t>000016 |     "xlsx": "0.18.5"</w:t>
-      </w:r>
-    </w:p>
-    <w:p>
-      <w:pPr>
-        <w:pStyle w:val="SourceCode"/>
-      </w:pPr>
-      <w:r>
-        <w:t>000017 |   }</w:t>
-      </w:r>
-    </w:p>
-    <w:p>
-      <w:pPr>
-        <w:pStyle w:val="SourceCode"/>
-      </w:pPr>
-      <w:r>
-        <w:t>000018 | }</w:t>
-      </w:r>
-    </w:p>
-    <w:p>
-      <w:pPr>
-        <w:pStyle w:val="SourceCode"/>
-      </w:pPr>
-      <w:r>
-        <w:t xml:space="preserve">000019 | </w:t>
+        <w:t>Líneas del archivo: 5. El posible párrafo vacío final preserva un salto de línea de cierre.</w:t>
+      </w:r>
+    </w:p>
+    <w:p>
+      <w:pPr>
+        <w:pStyle w:val="SourceCode"/>
+      </w:pPr>
+      <w:r>
+        <w:t>000001 | const fs=require('node:fs');const vm=require('node:vm');const assert=require('node:assert/strict');</w:t>
+      </w:r>
+    </w:p>
+    <w:p>
+      <w:pPr>
+        <w:pStyle w:val="SourceCode"/>
+      </w:pPr>
+      <w:r>
+        <w:t>000002 | for(const name of ['app.js','core.js','ocr.js','analyze.js','catalog.js']) {const text=fs.readFileSync('dist/'+name,'utf8');assert(text.length&gt;500,name+' incompleto');new vm.Script(text,{filename:name});assert(!/&lt;html/i.test(text),name+' contiene HTML');}</w:t>
+      </w:r>
+    </w:p>
+    <w:p>
+      <w:pPr>
+        <w:pStyle w:val="SourceCode"/>
+      </w:pPr>
+      <w:r>
+        <w:t>000003 | const html=fs.readFileSync('dist/index.html','utf8');assert(/FONCEP/i.test(html));assert(/app\.js/.test(html));</w:t>
+      </w:r>
+    </w:p>
+    <w:p>
+      <w:pPr>
+        <w:pStyle w:val="SourceCode"/>
+      </w:pPr>
+      <w:r>
+        <w:t>000004 | for(const file of ['vendor/ocr/lang/spa.traineddata.gz','vendor/ocr/core/tesseract-core-lstm.wasm','vendor/pdf-lib.min.js','vendor/pdf.worker.min.js'])assert(fs.statSync('dist/'+file).size&gt;1000,file);</w:t>
+      </w:r>
+    </w:p>
+    <w:p>
+      <w:pPr>
+        <w:pStyle w:val="SourceCode"/>
+      </w:pPr>
+      <w:r>
+        <w:t>000005 | console.log('Fuentes JavaScript, página y recursos OCR verificados.');</w:t>
+      </w:r>
+    </w:p>
+    <w:p>
+      <w:pPr>
+        <w:pStyle w:val="SourceCode"/>
+      </w:pPr>
+      <w:r>
+        <w:t xml:space="preserve">000006 | </w:t>
       </w:r>
     </w:p>
     <w:p>
@@ -6868,12 +7493,12 @@
         <w:pStyle w:val="Heading2"/>
       </w:pPr>
       <w:r>
-        <w:t>.github/workflows/pages.yml</w:t>
-      </w:r>
-    </w:p>
-    <w:p>
-      <w:r>
-        <w:t>SHA-256 del archivo: a846c6f4c94f6b530a2bc1b8b0b5e9d7ff088ca929f9ee040e830abf06bfa55e</w:t>
+        <w:t>package.json</w:t>
+      </w:r>
+    </w:p>
+    <w:p>
+      <w:r>
+        <w:t>SHA-256 del archivo: b381d701655c8795064095ed31873099e92098722ede0af48d252dcd3cbee843</w:t>
       </w:r>
     </w:p>
     <w:p>
@@ -6886,7 +7511,7 @@
             <w:color w:val="14665C"/>
             <w:u w:val="single"/>
           </w:rPr>
-          <w:t>https://github.com/deivy199130-arch/foncep-organizador/blob/56c3d3351c05dec873ad03a79229c55810fc8af2/.github/workflows/pages.yml</w:t>
+          <w:t>https://github.com/deivy199130-arch/foncep-organizador/blob/d833fd8f00ea7bc127f380df4452c00ff74f2792/package.json</w:t>
         </w:r>
       </w:hyperlink>
       <w:r/>
@@ -6894,367 +7519,159 @@
     </w:p>
     <w:p>
       <w:r>
-        <w:t>Líneas del archivo: 44. El posible párrafo vacío final preserva un salto de línea de cierre.</w:t>
-      </w:r>
-    </w:p>
-    <w:p>
-      <w:pPr>
-        <w:pStyle w:val="SourceCode"/>
-      </w:pPr>
-      <w:r>
-        <w:t>000001 | name: Publicar FONCEP</w:t>
-      </w:r>
-    </w:p>
-    <w:p>
-      <w:pPr>
-        <w:pStyle w:val="SourceCode"/>
-      </w:pPr>
-      <w:r>
-        <w:t>000002 | on:</w:t>
-      </w:r>
-    </w:p>
-    <w:p>
-      <w:pPr>
-        <w:pStyle w:val="SourceCode"/>
-      </w:pPr>
-      <w:r>
-        <w:t>000003 |   push:</w:t>
-      </w:r>
-    </w:p>
-    <w:p>
-      <w:pPr>
-        <w:pStyle w:val="SourceCode"/>
-      </w:pPr>
-      <w:r>
-        <w:t>000004 |     branches: [main]</w:t>
-      </w:r>
-    </w:p>
-    <w:p>
-      <w:pPr>
-        <w:pStyle w:val="SourceCode"/>
-      </w:pPr>
-      <w:r>
-        <w:t>000005 |   workflow_dispatch:</w:t>
-      </w:r>
-    </w:p>
-    <w:p>
-      <w:pPr>
-        <w:pStyle w:val="SourceCode"/>
-      </w:pPr>
-      <w:r>
-        <w:t>000006 | permissions:</w:t>
-      </w:r>
-    </w:p>
-    <w:p>
-      <w:pPr>
-        <w:pStyle w:val="SourceCode"/>
-      </w:pPr>
-      <w:r>
-        <w:t>000007 |   contents: read</w:t>
-      </w:r>
-    </w:p>
-    <w:p>
-      <w:pPr>
-        <w:pStyle w:val="SourceCode"/>
-      </w:pPr>
-      <w:r>
-        <w:t>000008 |   pages: write</w:t>
-      </w:r>
-    </w:p>
-    <w:p>
-      <w:pPr>
-        <w:pStyle w:val="SourceCode"/>
-      </w:pPr>
-      <w:r>
-        <w:t>000009 |   id-token: write</w:t>
-      </w:r>
-    </w:p>
-    <w:p>
-      <w:pPr>
-        <w:pStyle w:val="SourceCode"/>
-      </w:pPr>
-      <w:r>
-        <w:t>000010 | concurrency:</w:t>
-      </w:r>
-    </w:p>
-    <w:p>
-      <w:pPr>
-        <w:pStyle w:val="SourceCode"/>
-      </w:pPr>
-      <w:r>
-        <w:t>000011 |   group: pages</w:t>
-      </w:r>
-    </w:p>
-    <w:p>
-      <w:pPr>
-        <w:pStyle w:val="SourceCode"/>
-      </w:pPr>
-      <w:r>
-        <w:t>000012 |   cancel-in-progress: false</w:t>
-      </w:r>
-    </w:p>
-    <w:p>
-      <w:pPr>
-        <w:pStyle w:val="SourceCode"/>
-      </w:pPr>
-      <w:r>
-        <w:t>000013 | jobs:</w:t>
-      </w:r>
-    </w:p>
-    <w:p>
-      <w:pPr>
-        <w:pStyle w:val="SourceCode"/>
-      </w:pPr>
-      <w:r>
-        <w:t>000014 |   build:</w:t>
-      </w:r>
-    </w:p>
-    <w:p>
-      <w:pPr>
-        <w:pStyle w:val="SourceCode"/>
-      </w:pPr>
-      <w:r>
-        <w:t>000015 |     runs-on: ubuntu-latest</w:t>
-      </w:r>
-    </w:p>
-    <w:p>
-      <w:pPr>
-        <w:pStyle w:val="SourceCode"/>
-      </w:pPr>
-      <w:r>
-        <w:t>000016 |     steps:</w:t>
-      </w:r>
-    </w:p>
-    <w:p>
-      <w:pPr>
-        <w:pStyle w:val="SourceCode"/>
-      </w:pPr>
-      <w:r>
-        <w:t>000017 |       - uses: actions/checkout@v4</w:t>
-      </w:r>
-    </w:p>
-    <w:p>
-      <w:pPr>
-        <w:pStyle w:val="SourceCode"/>
-      </w:pPr>
-      <w:r>
-        <w:t>000018 |         with:</w:t>
-      </w:r>
-    </w:p>
-    <w:p>
-      <w:pPr>
-        <w:pStyle w:val="SourceCode"/>
-      </w:pPr>
-      <w:r>
-        <w:t>000019 |           ref: main</w:t>
-      </w:r>
-    </w:p>
-    <w:p>
-      <w:pPr>
-        <w:pStyle w:val="SourceCode"/>
-      </w:pPr>
-      <w:r>
-        <w:t>000020 |       - name: Comprobar migración</w:t>
-      </w:r>
-    </w:p>
-    <w:p>
-      <w:pPr>
-        <w:pStyle w:val="SourceCode"/>
-      </w:pPr>
-      <w:r>
-        <w:t>000021 |         run: test -f dist/index.html</w:t>
-      </w:r>
-    </w:p>
-    <w:p>
-      <w:pPr>
-        <w:pStyle w:val="SourceCode"/>
-      </w:pPr>
-      <w:r>
-        <w:t>000022 |       - uses: actions/setup-node@v4</w:t>
-      </w:r>
-    </w:p>
-    <w:p>
-      <w:pPr>
-        <w:pStyle w:val="SourceCode"/>
-      </w:pPr>
-      <w:r>
-        <w:t>000023 |         with:</w:t>
-      </w:r>
-    </w:p>
-    <w:p>
-      <w:pPr>
-        <w:pStyle w:val="SourceCode"/>
-      </w:pPr>
-      <w:r>
-        <w:t>000024 |           node-version: '22'</w:t>
-      </w:r>
-    </w:p>
-    <w:p>
-      <w:pPr>
-        <w:pStyle w:val="SourceCode"/>
-      </w:pPr>
-      <w:r>
-        <w:t>000025 |           cache: npm</w:t>
-      </w:r>
-    </w:p>
-    <w:p>
-      <w:pPr>
-        <w:pStyle w:val="SourceCode"/>
-      </w:pPr>
-      <w:r>
-        <w:t>000026 |       - run: npm ci --ignore-scripts --no-audit --no-fund</w:t>
-      </w:r>
-    </w:p>
-    <w:p>
-      <w:pPr>
-        <w:pStyle w:val="SourceCode"/>
-      </w:pPr>
-      <w:r>
-        <w:t>000027 |       - run: npm run build</w:t>
-      </w:r>
-    </w:p>
-    <w:p>
-      <w:pPr>
-        <w:pStyle w:val="SourceCode"/>
-      </w:pPr>
-      <w:r>
-        <w:t>000028 |       - run: npm test</w:t>
-      </w:r>
-    </w:p>
-    <w:p>
-      <w:pPr>
-        <w:pStyle w:val="SourceCode"/>
-      </w:pPr>
-      <w:r>
-        <w:t>000029 |       - uses: actions/configure-pages@v5</w:t>
-      </w:r>
-    </w:p>
-    <w:p>
-      <w:pPr>
-        <w:pStyle w:val="SourceCode"/>
-      </w:pPr>
-      <w:r>
-        <w:t>000030 |         with:</w:t>
-      </w:r>
-    </w:p>
-    <w:p>
-      <w:pPr>
-        <w:pStyle w:val="SourceCode"/>
-      </w:pPr>
-      <w:r>
-        <w:t>000031 |           enablement: true</w:t>
-      </w:r>
-    </w:p>
-    <w:p>
-      <w:pPr>
-        <w:pStyle w:val="SourceCode"/>
-      </w:pPr>
-      <w:r>
-        <w:t>000032 |       - uses: actions/upload-pages-artifact@v3</w:t>
-      </w:r>
-    </w:p>
-    <w:p>
-      <w:pPr>
-        <w:pStyle w:val="SourceCode"/>
-      </w:pPr>
-      <w:r>
-        <w:t>000033 |         with:</w:t>
-      </w:r>
-    </w:p>
-    <w:p>
-      <w:pPr>
-        <w:pStyle w:val="SourceCode"/>
-      </w:pPr>
-      <w:r>
-        <w:t>000034 |           path: dist</w:t>
-      </w:r>
-    </w:p>
-    <w:p>
-      <w:pPr>
-        <w:pStyle w:val="SourceCode"/>
-      </w:pPr>
-      <w:r>
-        <w:t>000035 |   deploy:</w:t>
-      </w:r>
-    </w:p>
-    <w:p>
-      <w:pPr>
-        <w:pStyle w:val="SourceCode"/>
-      </w:pPr>
-      <w:r>
-        <w:t>000036 |     needs: build</w:t>
-      </w:r>
-    </w:p>
-    <w:p>
-      <w:pPr>
-        <w:pStyle w:val="SourceCode"/>
-      </w:pPr>
-      <w:r>
-        <w:t>000037 |     runs-on: ubuntu-latest</w:t>
-      </w:r>
-    </w:p>
-    <w:p>
-      <w:pPr>
-        <w:pStyle w:val="SourceCode"/>
-      </w:pPr>
-      <w:r>
-        <w:t>000038 |     environment:</w:t>
-      </w:r>
-    </w:p>
-    <w:p>
-      <w:pPr>
-        <w:pStyle w:val="SourceCode"/>
-      </w:pPr>
-      <w:r>
-        <w:t>000039 |       name: github-pages</w:t>
-      </w:r>
-    </w:p>
-    <w:p>
-      <w:pPr>
-        <w:pStyle w:val="SourceCode"/>
-      </w:pPr>
-      <w:r>
-        <w:t>000040 |       url: ${{ steps.deployment.outputs.page_url }}</w:t>
-      </w:r>
-    </w:p>
-    <w:p>
-      <w:pPr>
-        <w:pStyle w:val="SourceCode"/>
-      </w:pPr>
-      <w:r>
-        <w:t>000041 |     steps:</w:t>
-      </w:r>
-    </w:p>
-    <w:p>
-      <w:pPr>
-        <w:pStyle w:val="SourceCode"/>
-      </w:pPr>
-      <w:r>
-        <w:t>000042 |       - name: Publicar</w:t>
-      </w:r>
-    </w:p>
-    <w:p>
-      <w:pPr>
-        <w:pStyle w:val="SourceCode"/>
-      </w:pPr>
-      <w:r>
-        <w:t>000043 |         id: deployment</w:t>
-      </w:r>
-    </w:p>
-    <w:p>
-      <w:pPr>
-        <w:pStyle w:val="SourceCode"/>
-      </w:pPr>
-      <w:r>
-        <w:t>000044 |         uses: actions/deploy-pages@v4</w:t>
-      </w:r>
-    </w:p>
-    <w:p>
-      <w:pPr>
-        <w:pStyle w:val="SourceCode"/>
-      </w:pPr>
-      <w:r>
-        <w:t xml:space="preserve">000045 | </w:t>
+        <w:t>Líneas del archivo: 18. El posible párrafo vacío final preserva un salto de línea de cierre.</w:t>
+      </w:r>
+    </w:p>
+    <w:p>
+      <w:pPr>
+        <w:pStyle w:val="SourceCode"/>
+      </w:pPr>
+      <w:r>
+        <w:t>000001 | {</w:t>
+      </w:r>
+    </w:p>
+    <w:p>
+      <w:pPr>
+        <w:pStyle w:val="SourceCode"/>
+      </w:pPr>
+      <w:r>
+        <w:t>000002 |   "name": "foncep-organizador",</w:t>
+      </w:r>
+    </w:p>
+    <w:p>
+      <w:pPr>
+        <w:pStyle w:val="SourceCode"/>
+      </w:pPr>
+      <w:r>
+        <w:t>000003 |   "version": "1.0.0",</w:t>
+      </w:r>
+    </w:p>
+    <w:p>
+      <w:pPr>
+        <w:pStyle w:val="SourceCode"/>
+      </w:pPr>
+      <w:r>
+        <w:t>000004 |   "private": true,</w:t>
+      </w:r>
+    </w:p>
+    <w:p>
+      <w:pPr>
+        <w:pStyle w:val="SourceCode"/>
+      </w:pPr>
+      <w:r>
+        <w:t>000005 |   "type": "commonjs",</w:t>
+      </w:r>
+    </w:p>
+    <w:p>
+      <w:pPr>
+        <w:pStyle w:val="SourceCode"/>
+      </w:pPr>
+      <w:r>
+        <w:t>000006 |   "scripts": {</w:t>
+      </w:r>
+    </w:p>
+    <w:p>
+      <w:pPr>
+        <w:pStyle w:val="SourceCode"/>
+      </w:pPr>
+      <w:r>
+        <w:t>000007 |     "build": "node build.cjs",</w:t>
+      </w:r>
+    </w:p>
+    <w:p>
+      <w:pPr>
+        <w:pStyle w:val="SourceCode"/>
+      </w:pPr>
+      <w:r>
+        <w:t>000008 |     "test": "node verify.cjs"</w:t>
+      </w:r>
+    </w:p>
+    <w:p>
+      <w:pPr>
+        <w:pStyle w:val="SourceCode"/>
+      </w:pPr>
+      <w:r>
+        <w:t>000009 |   },</w:t>
+      </w:r>
+    </w:p>
+    <w:p>
+      <w:pPr>
+        <w:pStyle w:val="SourceCode"/>
+      </w:pPr>
+      <w:r>
+        <w:t>000010 |   "dependencies": {</w:t>
+      </w:r>
+    </w:p>
+    <w:p>
+      <w:pPr>
+        <w:pStyle w:val="SourceCode"/>
+      </w:pPr>
+      <w:r>
+        <w:t>000011 |     "@tesseract.js-data/spa": "1.0.0",</w:t>
+      </w:r>
+    </w:p>
+    <w:p>
+      <w:pPr>
+        <w:pStyle w:val="SourceCode"/>
+      </w:pPr>
+      <w:r>
+        <w:t>000012 |     "jszip": "3.10.1",</w:t>
+      </w:r>
+    </w:p>
+    <w:p>
+      <w:pPr>
+        <w:pStyle w:val="SourceCode"/>
+      </w:pPr>
+      <w:r>
+        <w:t>000013 |     "pdf-lib": "1.17.1",</w:t>
+      </w:r>
+    </w:p>
+    <w:p>
+      <w:pPr>
+        <w:pStyle w:val="SourceCode"/>
+      </w:pPr>
+      <w:r>
+        <w:t>000014 |     "pdfjs-dist": "3.11.174",</w:t>
+      </w:r>
+    </w:p>
+    <w:p>
+      <w:pPr>
+        <w:pStyle w:val="SourceCode"/>
+      </w:pPr>
+      <w:r>
+        <w:t>000015 |     "tesseract.js": "6.0.1",</w:t>
+      </w:r>
+    </w:p>
+    <w:p>
+      <w:pPr>
+        <w:pStyle w:val="SourceCode"/>
+      </w:pPr>
+      <w:r>
+        <w:t>000016 |     "xlsx": "0.18.5"</w:t>
+      </w:r>
+    </w:p>
+    <w:p>
+      <w:pPr>
+        <w:pStyle w:val="SourceCode"/>
+      </w:pPr>
+      <w:r>
+        <w:t>000017 |   }</w:t>
+      </w:r>
+    </w:p>
+    <w:p>
+      <w:pPr>
+        <w:pStyle w:val="SourceCode"/>
+      </w:pPr>
+      <w:r>
+        <w:t>000018 | }</w:t>
+      </w:r>
+    </w:p>
+    <w:p>
+      <w:pPr>
+        <w:pStyle w:val="SourceCode"/>
+      </w:pPr>
+      <w:r>
+        <w:t xml:space="preserve">000019 | </w:t>
       </w:r>
     </w:p>
     <w:p>
@@ -7267,12 +7684,12 @@
         <w:pStyle w:val="Heading2"/>
       </w:pPr>
       <w:r>
-        <w:t>.gitignore</w:t>
-      </w:r>
-    </w:p>
-    <w:p>
-      <w:r>
-        <w:t>SHA-256 del archivo: e7f3dc01c24514310d6f92fd4e1fde2f09afebfdbdc838d72af480871e04b3b4</w:t>
+        <w:t>.github/workflows/pages.yml</w:t>
+      </w:r>
+    </w:p>
+    <w:p>
+      <w:r>
+        <w:t>SHA-256 del archivo: a846c6f4c94f6b530a2bc1b8b0b5e9d7ff088ca929f9ee040e830abf06bfa55e</w:t>
       </w:r>
     </w:p>
     <w:p>
@@ -7285,7 +7702,7 @@
             <w:color w:val="14665C"/>
             <w:u w:val="single"/>
           </w:rPr>
-          <w:t>https://github.com/deivy199130-arch/foncep-organizador/blob/56c3d3351c05dec873ad03a79229c55810fc8af2/.gitignore</w:t>
+          <w:t>https://github.com/deivy199130-arch/foncep-organizador/blob/d833fd8f00ea7bc127f380df4452c00ff74f2792/.github/workflows/pages.yml</w:t>
         </w:r>
       </w:hyperlink>
       <w:r/>
@@ -7293,39 +7710,367 @@
     </w:p>
     <w:p>
       <w:r>
-        <w:t>Líneas del archivo: 3. El posible párrafo vacío final preserva un salto de línea de cierre.</w:t>
-      </w:r>
-    </w:p>
-    <w:p>
-      <w:pPr>
-        <w:pStyle w:val="SourceCode"/>
-      </w:pPr>
-      <w:r>
-        <w:t>000001 | node_modules/</w:t>
-      </w:r>
-    </w:p>
-    <w:p>
-      <w:pPr>
-        <w:pStyle w:val="SourceCode"/>
-      </w:pPr>
-      <w:r>
-        <w:t>000002 | dist/vendor/</w:t>
-      </w:r>
-    </w:p>
-    <w:p>
-      <w:pPr>
-        <w:pStyle w:val="SourceCode"/>
-      </w:pPr>
-      <w:r>
-        <w:t>000003 | dist/.nojekyll</w:t>
-      </w:r>
-    </w:p>
-    <w:p>
-      <w:pPr>
-        <w:pStyle w:val="SourceCode"/>
-      </w:pPr>
-      <w:r>
-        <w:t xml:space="preserve">000004 | </w:t>
+        <w:t>Líneas del archivo: 44. El posible párrafo vacío final preserva un salto de línea de cierre.</w:t>
+      </w:r>
+    </w:p>
+    <w:p>
+      <w:pPr>
+        <w:pStyle w:val="SourceCode"/>
+      </w:pPr>
+      <w:r>
+        <w:t>000001 | name: Publicar FONCEP</w:t>
+      </w:r>
+    </w:p>
+    <w:p>
+      <w:pPr>
+        <w:pStyle w:val="SourceCode"/>
+      </w:pPr>
+      <w:r>
+        <w:t>000002 | on:</w:t>
+      </w:r>
+    </w:p>
+    <w:p>
+      <w:pPr>
+        <w:pStyle w:val="SourceCode"/>
+      </w:pPr>
+      <w:r>
+        <w:t>000003 |   push:</w:t>
+      </w:r>
+    </w:p>
+    <w:p>
+      <w:pPr>
+        <w:pStyle w:val="SourceCode"/>
+      </w:pPr>
+      <w:r>
+        <w:t>000004 |     branches: [main]</w:t>
+      </w:r>
+    </w:p>
+    <w:p>
+      <w:pPr>
+        <w:pStyle w:val="SourceCode"/>
+      </w:pPr>
+      <w:r>
+        <w:t>000005 |   workflow_dispatch:</w:t>
+      </w:r>
+    </w:p>
+    <w:p>
+      <w:pPr>
+        <w:pStyle w:val="SourceCode"/>
+      </w:pPr>
+      <w:r>
+        <w:t>000006 | permissions:</w:t>
+      </w:r>
+    </w:p>
+    <w:p>
+      <w:pPr>
+        <w:pStyle w:val="SourceCode"/>
+      </w:pPr>
+      <w:r>
+        <w:t>000007 |   contents: read</w:t>
+      </w:r>
+    </w:p>
+    <w:p>
+      <w:pPr>
+        <w:pStyle w:val="SourceCode"/>
+      </w:pPr>
+      <w:r>
+        <w:t>000008 |   pages: write</w:t>
+      </w:r>
+    </w:p>
+    <w:p>
+      <w:pPr>
+        <w:pStyle w:val="SourceCode"/>
+      </w:pPr>
+      <w:r>
+        <w:t>000009 |   id-token: write</w:t>
+      </w:r>
+    </w:p>
+    <w:p>
+      <w:pPr>
+        <w:pStyle w:val="SourceCode"/>
+      </w:pPr>
+      <w:r>
+        <w:t>000010 | concurrency:</w:t>
+      </w:r>
+    </w:p>
+    <w:p>
+      <w:pPr>
+        <w:pStyle w:val="SourceCode"/>
+      </w:pPr>
+      <w:r>
+        <w:t>000011 |   group: pages</w:t>
+      </w:r>
+    </w:p>
+    <w:p>
+      <w:pPr>
+        <w:pStyle w:val="SourceCode"/>
+      </w:pPr>
+      <w:r>
+        <w:t>000012 |   cancel-in-progress: false</w:t>
+      </w:r>
+    </w:p>
+    <w:p>
+      <w:pPr>
+        <w:pStyle w:val="SourceCode"/>
+      </w:pPr>
+      <w:r>
+        <w:t>000013 | jobs:</w:t>
+      </w:r>
+    </w:p>
+    <w:p>
+      <w:pPr>
+        <w:pStyle w:val="SourceCode"/>
+      </w:pPr>
+      <w:r>
+        <w:t>000014 |   build:</w:t>
+      </w:r>
+    </w:p>
+    <w:p>
+      <w:pPr>
+        <w:pStyle w:val="SourceCode"/>
+      </w:pPr>
+      <w:r>
+        <w:t>000015 |     runs-on: ubuntu-latest</w:t>
+      </w:r>
+    </w:p>
+    <w:p>
+      <w:pPr>
+        <w:pStyle w:val="SourceCode"/>
+      </w:pPr>
+      <w:r>
+        <w:t>000016 |     steps:</w:t>
+      </w:r>
+    </w:p>
+    <w:p>
+      <w:pPr>
+        <w:pStyle w:val="SourceCode"/>
+      </w:pPr>
+      <w:r>
+        <w:t>000017 |       - uses: actions/checkout@v4</w:t>
+      </w:r>
+    </w:p>
+    <w:p>
+      <w:pPr>
+        <w:pStyle w:val="SourceCode"/>
+      </w:pPr>
+      <w:r>
+        <w:t>000018 |         with:</w:t>
+      </w:r>
+    </w:p>
+    <w:p>
+      <w:pPr>
+        <w:pStyle w:val="SourceCode"/>
+      </w:pPr>
+      <w:r>
+        <w:t>000019 |           ref: main</w:t>
+      </w:r>
+    </w:p>
+    <w:p>
+      <w:pPr>
+        <w:pStyle w:val="SourceCode"/>
+      </w:pPr>
+      <w:r>
+        <w:t>000020 |       - name: Comprobar migración</w:t>
+      </w:r>
+    </w:p>
+    <w:p>
+      <w:pPr>
+        <w:pStyle w:val="SourceCode"/>
+      </w:pPr>
+      <w:r>
+        <w:t>000021 |         run: test -f dist/index.html</w:t>
+      </w:r>
+    </w:p>
+    <w:p>
+      <w:pPr>
+        <w:pStyle w:val="SourceCode"/>
+      </w:pPr>
+      <w:r>
+        <w:t>000022 |       - uses: actions/setup-node@v4</w:t>
+      </w:r>
+    </w:p>
+    <w:p>
+      <w:pPr>
+        <w:pStyle w:val="SourceCode"/>
+      </w:pPr>
+      <w:r>
+        <w:t>000023 |         with:</w:t>
+      </w:r>
+    </w:p>
+    <w:p>
+      <w:pPr>
+        <w:pStyle w:val="SourceCode"/>
+      </w:pPr>
+      <w:r>
+        <w:t>000024 |           node-version: '22'</w:t>
+      </w:r>
+    </w:p>
+    <w:p>
+      <w:pPr>
+        <w:pStyle w:val="SourceCode"/>
+      </w:pPr>
+      <w:r>
+        <w:t>000025 |           cache: npm</w:t>
+      </w:r>
+    </w:p>
+    <w:p>
+      <w:pPr>
+        <w:pStyle w:val="SourceCode"/>
+      </w:pPr>
+      <w:r>
+        <w:t>000026 |       - run: npm ci --ignore-scripts --no-audit --no-fund</w:t>
+      </w:r>
+    </w:p>
+    <w:p>
+      <w:pPr>
+        <w:pStyle w:val="SourceCode"/>
+      </w:pPr>
+      <w:r>
+        <w:t>000027 |       - run: npm run build</w:t>
+      </w:r>
+    </w:p>
+    <w:p>
+      <w:pPr>
+        <w:pStyle w:val="SourceCode"/>
+      </w:pPr>
+      <w:r>
+        <w:t>000028 |       - run: npm test</w:t>
+      </w:r>
+    </w:p>
+    <w:p>
+      <w:pPr>
+        <w:pStyle w:val="SourceCode"/>
+      </w:pPr>
+      <w:r>
+        <w:t>000029 |       - uses: actions/configure-pages@v5</w:t>
+      </w:r>
+    </w:p>
+    <w:p>
+      <w:pPr>
+        <w:pStyle w:val="SourceCode"/>
+      </w:pPr>
+      <w:r>
+        <w:t>000030 |         with:</w:t>
+      </w:r>
+    </w:p>
+    <w:p>
+      <w:pPr>
+        <w:pStyle w:val="SourceCode"/>
+      </w:pPr>
+      <w:r>
+        <w:t>000031 |           enablement: true</w:t>
+      </w:r>
+    </w:p>
+    <w:p>
+      <w:pPr>
+        <w:pStyle w:val="SourceCode"/>
+      </w:pPr>
+      <w:r>
+        <w:t>000032 |       - uses: actions/upload-pages-artifact@v3</w:t>
+      </w:r>
+    </w:p>
+    <w:p>
+      <w:pPr>
+        <w:pStyle w:val="SourceCode"/>
+      </w:pPr>
+      <w:r>
+        <w:t>000033 |         with:</w:t>
+      </w:r>
+    </w:p>
+    <w:p>
+      <w:pPr>
+        <w:pStyle w:val="SourceCode"/>
+      </w:pPr>
+      <w:r>
+        <w:t>000034 |           path: dist</w:t>
+      </w:r>
+    </w:p>
+    <w:p>
+      <w:pPr>
+        <w:pStyle w:val="SourceCode"/>
+      </w:pPr>
+      <w:r>
+        <w:t>000035 |   deploy:</w:t>
+      </w:r>
+    </w:p>
+    <w:p>
+      <w:pPr>
+        <w:pStyle w:val="SourceCode"/>
+      </w:pPr>
+      <w:r>
+        <w:t>000036 |     needs: build</w:t>
+      </w:r>
+    </w:p>
+    <w:p>
+      <w:pPr>
+        <w:pStyle w:val="SourceCode"/>
+      </w:pPr>
+      <w:r>
+        <w:t>000037 |     runs-on: ubuntu-latest</w:t>
+      </w:r>
+    </w:p>
+    <w:p>
+      <w:pPr>
+        <w:pStyle w:val="SourceCode"/>
+      </w:pPr>
+      <w:r>
+        <w:t>000038 |     environment:</w:t>
+      </w:r>
+    </w:p>
+    <w:p>
+      <w:pPr>
+        <w:pStyle w:val="SourceCode"/>
+      </w:pPr>
+      <w:r>
+        <w:t>000039 |       name: github-pages</w:t>
+      </w:r>
+    </w:p>
+    <w:p>
+      <w:pPr>
+        <w:pStyle w:val="SourceCode"/>
+      </w:pPr>
+      <w:r>
+        <w:t>000040 |       url: ${{ steps.deployment.outputs.page_url }}</w:t>
+      </w:r>
+    </w:p>
+    <w:p>
+      <w:pPr>
+        <w:pStyle w:val="SourceCode"/>
+      </w:pPr>
+      <w:r>
+        <w:t>000041 |     steps:</w:t>
+      </w:r>
+    </w:p>
+    <w:p>
+      <w:pPr>
+        <w:pStyle w:val="SourceCode"/>
+      </w:pPr>
+      <w:r>
+        <w:t>000042 |       - name: Publicar</w:t>
+      </w:r>
+    </w:p>
+    <w:p>
+      <w:pPr>
+        <w:pStyle w:val="SourceCode"/>
+      </w:pPr>
+      <w:r>
+        <w:t>000043 |         id: deployment</w:t>
+      </w:r>
+    </w:p>
+    <w:p>
+      <w:pPr>
+        <w:pStyle w:val="SourceCode"/>
+      </w:pPr>
+      <w:r>
+        <w:t>000044 |         uses: actions/deploy-pages@v4</w:t>
+      </w:r>
+    </w:p>
+    <w:p>
+      <w:pPr>
+        <w:pStyle w:val="SourceCode"/>
+      </w:pPr>
+      <w:r>
+        <w:t xml:space="preserve">000045 | </w:t>
       </w:r>
     </w:p>
     <w:p>
@@ -7338,12 +8083,12 @@
         <w:pStyle w:val="Heading2"/>
       </w:pPr>
       <w:r>
-        <w:t>README.md</w:t>
-      </w:r>
-    </w:p>
-    <w:p>
-      <w:r>
-        <w:t>SHA-256 del archivo: 6e1c74c9befb9033cb9d9075212904ada8053d2160a9541d002f0fc0ee516ece</w:t>
+        <w:t>.gitignore</w:t>
+      </w:r>
+    </w:p>
+    <w:p>
+      <w:r>
+        <w:t>SHA-256 del archivo: e7f3dc01c24514310d6f92fd4e1fde2f09afebfdbdc838d72af480871e04b3b4</w:t>
       </w:r>
     </w:p>
     <w:p>
@@ -7356,7 +8101,7 @@
             <w:color w:val="14665C"/>
             <w:u w:val="single"/>
           </w:rPr>
-          <w:t>https://github.com/deivy199130-arch/foncep-organizador/blob/56c3d3351c05dec873ad03a79229c55810fc8af2/README.md</w:t>
+          <w:t>https://github.com/deivy199130-arch/foncep-organizador/blob/d833fd8f00ea7bc127f380df4452c00ff74f2792/.gitignore</w:t>
         </w:r>
       </w:hyperlink>
       <w:r/>
@@ -7364,31 +8109,31 @@
     </w:p>
     <w:p>
       <w:r>
-        <w:t>Líneas del archivo: 25. El posible párrafo vacío final preserva un salto de línea de cierre.</w:t>
-      </w:r>
-    </w:p>
-    <w:p>
-      <w:pPr>
-        <w:pStyle w:val="SourceCode"/>
-      </w:pPr>
-      <w:r>
-        <w:t>000001 | # Organizador documental FONCEP</w:t>
-      </w:r>
-    </w:p>
-    <w:p>
-      <w:pPr>
-        <w:pStyle w:val="SourceCode"/>
-      </w:pPr>
-      <w:r>
-        <w:t xml:space="preserve">000002 | </w:t>
-      </w:r>
-    </w:p>
-    <w:p>
-      <w:pPr>
-        <w:pStyle w:val="SourceCode"/>
-      </w:pPr>
-      <w:r>
-        <w:t>000003 | Aplicación web independiente, con OCR en español dentro del navegador. No requiere cuenta ni servicios de ChatGPT. Los documentos se procesan en el dispositivo del usuario.</w:t>
+        <w:t>Líneas del archivo: 3. El posible párrafo vacío final preserva un salto de línea de cierre.</w:t>
+      </w:r>
+    </w:p>
+    <w:p>
+      <w:pPr>
+        <w:pStyle w:val="SourceCode"/>
+      </w:pPr>
+      <w:r>
+        <w:t>000001 | node_modules/</w:t>
+      </w:r>
+    </w:p>
+    <w:p>
+      <w:pPr>
+        <w:pStyle w:val="SourceCode"/>
+      </w:pPr>
+      <w:r>
+        <w:t>000002 | dist/vendor/</w:t>
+      </w:r>
+    </w:p>
+    <w:p>
+      <w:pPr>
+        <w:pStyle w:val="SourceCode"/>
+      </w:pPr>
+      <w:r>
+        <w:t>000003 | dist/.nojekyll</w:t>
       </w:r>
     </w:p>
     <w:p>
@@ -7400,210 +8145,21 @@
       </w:r>
     </w:p>
     <w:p>
-      <w:pPr>
-        <w:pStyle w:val="SourceCode"/>
-      </w:pPr>
-      <w:r>
-        <w:t>000005 | ## Uso</w:t>
-      </w:r>
-    </w:p>
-    <w:p>
-      <w:pPr>
-        <w:pStyle w:val="SourceCode"/>
-      </w:pPr>
-      <w:r>
-        <w:t xml:space="preserve">000006 | </w:t>
-      </w:r>
-    </w:p>
-    <w:p>
-      <w:pPr>
-        <w:pStyle w:val="SourceCode"/>
-      </w:pPr>
-      <w:r>
-        <w:t>000007 | 1. Cargar el Excel con los tipos documentales y seleccionar la hoja y columna del catálogo.</w:t>
-      </w:r>
-    </w:p>
-    <w:p>
-      <w:pPr>
-        <w:pStyle w:val="SourceCode"/>
-      </w:pPr>
-      <w:r>
-        <w:t>000008 | 2. Cargar los PDF de los expedientes.</w:t>
-      </w:r>
-    </w:p>
-    <w:p>
-      <w:pPr>
-        <w:pStyle w:val="SourceCode"/>
-      </w:pPr>
-      <w:r>
-        <w:t>000009 | 3. Analizar el texto y utilizar OCR para las páginas escaneadas.</w:t>
-      </w:r>
-    </w:p>
-    <w:p>
-      <w:pPr>
-        <w:pStyle w:val="SourceCode"/>
-      </w:pPr>
-      <w:r>
-        <w:t>000010 | 4. Revisar cada propuesta: llave, tipo documental y páginas. Aprobar las que sean correctas.</w:t>
-      </w:r>
-    </w:p>
-    <w:p>
-      <w:pPr>
-        <w:pStyle w:val="SourceCode"/>
-      </w:pPr>
-      <w:r>
-        <w:t>000011 | 5. Descargar el ZIP con carpetas por llave, documentos renombrados e informes de trazabilidad.</w:t>
-      </w:r>
-    </w:p>
-    <w:p>
-      <w:pPr>
-        <w:pStyle w:val="SourceCode"/>
-      </w:pPr>
-      <w:r>
-        <w:t xml:space="preserve">000012 | </w:t>
-      </w:r>
-    </w:p>
-    <w:p>
-      <w:pPr>
-        <w:pStyle w:val="SourceCode"/>
-      </w:pPr>
-      <w:r>
-        <w:t>000013 | La clasificación automática genera propuestas que requieren revisión. Los archivos originales no se modifican. Los PDF derivados no conservan la validez de firmas digitales del original.</w:t>
-      </w:r>
-    </w:p>
-    <w:p>
-      <w:pPr>
-        <w:pStyle w:val="SourceCode"/>
-      </w:pPr>
-      <w:r>
-        <w:t xml:space="preserve">000014 | </w:t>
-      </w:r>
-    </w:p>
-    <w:p>
-      <w:pPr>
-        <w:pStyle w:val="SourceCode"/>
-      </w:pPr>
-      <w:r>
-        <w:t>000015 | ## Publicación</w:t>
-      </w:r>
-    </w:p>
-    <w:p>
-      <w:pPr>
-        <w:pStyle w:val="SourceCode"/>
-      </w:pPr>
-      <w:r>
-        <w:t xml:space="preserve">000016 | </w:t>
-      </w:r>
-    </w:p>
-    <w:p>
-      <w:pPr>
-        <w:pStyle w:val="SourceCode"/>
-      </w:pPr>
-      <w:r>
-        <w:t>000017 | En Settings → Pages seleccionar **GitHub Actions**. El flujo Publicar FONCEP genera y publica la aplicación con las bibliotecas y el modelo OCR incluidos. No hay dependencias de ChatGPT durante el uso ni en las publicaciones posteriores a la migración inicial.</w:t>
-      </w:r>
-    </w:p>
-    <w:p>
-      <w:pPr>
-        <w:pStyle w:val="SourceCode"/>
-      </w:pPr>
-      <w:r>
-        <w:t xml:space="preserve">000018 | </w:t>
-      </w:r>
-    </w:p>
-    <w:p>
-      <w:pPr>
-        <w:pStyle w:val="SourceCode"/>
-      </w:pPr>
-      <w:r>
-        <w:t>000019 | Dirección prevista: https://deivy199130-arch.github.io/foncep-organizador/</w:t>
-      </w:r>
-    </w:p>
-    <w:p>
-      <w:pPr>
-        <w:pStyle w:val="SourceCode"/>
-      </w:pPr>
-      <w:r>
-        <w:t xml:space="preserve">000020 | </w:t>
-      </w:r>
-    </w:p>
-    <w:p>
-      <w:pPr>
-        <w:pStyle w:val="SourceCode"/>
-      </w:pPr>
-      <w:r>
-        <w:t>000021 | ## Desarrollo</w:t>
-      </w:r>
-    </w:p>
-    <w:p>
-      <w:pPr>
-        <w:pStyle w:val="SourceCode"/>
-      </w:pPr>
-      <w:r>
-        <w:t xml:space="preserve">000022 | </w:t>
-      </w:r>
-    </w:p>
-    <w:p>
-      <w:pPr>
-        <w:pStyle w:val="SourceCode"/>
-      </w:pPr>
-      <w:r>
-        <w:t>000023 | Node.js 22. Ejecutar `npm ci --ignore-scripts`, `npm run build` y `npm test`. Servir la carpeta dist mediante HTTP. No subir expedientes ni datos personales a este repositorio público.</w:t>
-      </w:r>
-    </w:p>
-    <w:p>
-      <w:pPr>
-        <w:pStyle w:val="SourceCode"/>
-      </w:pPr>
-      <w:r>
-        <w:t xml:space="preserve">000024 | </w:t>
-      </w:r>
-    </w:p>
-    <w:p>
-      <w:pPr>
-        <w:pStyle w:val="SourceCode"/>
-      </w:pPr>
-      <w:r>
-        <w:t>000025 | Las verificaciones de distribución comprueban la sintaxis y los recursos necesarios. La versión original contó con pruebas sintéticas de organización y análisis; falta validar la clasificación con expedientes reales y comprobarla en el celular del usuario.</w:t>
-      </w:r>
-    </w:p>
-    <w:p>
-      <w:pPr>
-        <w:pStyle w:val="SourceCode"/>
-      </w:pPr>
-      <w:r>
-        <w:t xml:space="preserve">000026 | </w:t>
-      </w:r>
-    </w:p>
-    <w:p>
       <w:r>
         <w:br w:type="page"/>
       </w:r>
     </w:p>
     <w:p>
       <w:pPr>
-        <w:pStyle w:val="Heading1"/>
-      </w:pPr>
-      <w:r>
-        <w:t>17. Anexo: dependencias exactas y migración histórica</w:t>
-      </w:r>
-    </w:p>
-    <w:p>
-      <w:r>
-        <w:t>package-lock.json fue generado por npm y se incluye completo para conocer las versiones e integridades de los paquetes. No es código escrito manualmente. El flujo import.yml se recupera del historial y ya fue eliminado de main. Su URL antigua corresponde únicamente a la transferencia de una sola vez.</w:t>
-      </w:r>
-    </w:p>
-    <w:p>
-      <w:pPr>
         <w:pStyle w:val="Heading2"/>
       </w:pPr>
       <w:r>
-        <w:t>17.1. package-lock.json completo</w:t>
-      </w:r>
-    </w:p>
-    <w:p>
-      <w:r>
-        <w:t>SHA-256 del archivo: 4303eb35d012460365a28a94c511978cec10bbc8eac43de902b03436e8118bbe</w:t>
+        <w:t>README.md</w:t>
+      </w:r>
+    </w:p>
+    <w:p>
+      <w:r>
+        <w:t>SHA-256 del archivo: 6e1c74c9befb9033cb9d9075212904ada8053d2160a9541d002f0fc0ee516ece</w:t>
       </w:r>
     </w:p>
     <w:p>
@@ -7616,7 +8172,7 @@
             <w:color w:val="14665C"/>
             <w:u w:val="single"/>
           </w:rPr>
-          <w:t>https://github.com/deivy199130-arch/foncep-organizador/blob/56c3d3351c05dec873ad03a79229c55810fc8af2/package-lock.json</w:t>
+          <w:t>https://github.com/deivy199130-arch/foncep-organizador/blob/d833fd8f00ea7bc127f380df4452c00ff74f2792/README.md</w:t>
         </w:r>
       </w:hyperlink>
       <w:r/>
@@ -7624,6 +8180,266 @@
     </w:p>
     <w:p>
       <w:r>
+        <w:t>Líneas del archivo: 25. El posible párrafo vacío final preserva un salto de línea de cierre.</w:t>
+      </w:r>
+    </w:p>
+    <w:p>
+      <w:pPr>
+        <w:pStyle w:val="SourceCode"/>
+      </w:pPr>
+      <w:r>
+        <w:t>000001 | # Organizador documental FONCEP</w:t>
+      </w:r>
+    </w:p>
+    <w:p>
+      <w:pPr>
+        <w:pStyle w:val="SourceCode"/>
+      </w:pPr>
+      <w:r>
+        <w:t xml:space="preserve">000002 | </w:t>
+      </w:r>
+    </w:p>
+    <w:p>
+      <w:pPr>
+        <w:pStyle w:val="SourceCode"/>
+      </w:pPr>
+      <w:r>
+        <w:t>000003 | Aplicación web independiente, con OCR en español dentro del navegador. No requiere cuenta ni servicios de ChatGPT. Los documentos se procesan en el dispositivo del usuario.</w:t>
+      </w:r>
+    </w:p>
+    <w:p>
+      <w:pPr>
+        <w:pStyle w:val="SourceCode"/>
+      </w:pPr>
+      <w:r>
+        <w:t xml:space="preserve">000004 | </w:t>
+      </w:r>
+    </w:p>
+    <w:p>
+      <w:pPr>
+        <w:pStyle w:val="SourceCode"/>
+      </w:pPr>
+      <w:r>
+        <w:t>000005 | ## Uso</w:t>
+      </w:r>
+    </w:p>
+    <w:p>
+      <w:pPr>
+        <w:pStyle w:val="SourceCode"/>
+      </w:pPr>
+      <w:r>
+        <w:t xml:space="preserve">000006 | </w:t>
+      </w:r>
+    </w:p>
+    <w:p>
+      <w:pPr>
+        <w:pStyle w:val="SourceCode"/>
+      </w:pPr>
+      <w:r>
+        <w:t>000007 | 1. Cargar el Excel con los tipos documentales y seleccionar la hoja y columna del catálogo.</w:t>
+      </w:r>
+    </w:p>
+    <w:p>
+      <w:pPr>
+        <w:pStyle w:val="SourceCode"/>
+      </w:pPr>
+      <w:r>
+        <w:t>000008 | 2. Cargar los PDF de los expedientes.</w:t>
+      </w:r>
+    </w:p>
+    <w:p>
+      <w:pPr>
+        <w:pStyle w:val="SourceCode"/>
+      </w:pPr>
+      <w:r>
+        <w:t>000009 | 3. Analizar el texto y utilizar OCR para las páginas escaneadas.</w:t>
+      </w:r>
+    </w:p>
+    <w:p>
+      <w:pPr>
+        <w:pStyle w:val="SourceCode"/>
+      </w:pPr>
+      <w:r>
+        <w:t>000010 | 4. Revisar cada propuesta: llave, tipo documental y páginas. Aprobar las que sean correctas.</w:t>
+      </w:r>
+    </w:p>
+    <w:p>
+      <w:pPr>
+        <w:pStyle w:val="SourceCode"/>
+      </w:pPr>
+      <w:r>
+        <w:t>000011 | 5. Descargar el ZIP con carpetas por llave, documentos renombrados e informes de trazabilidad.</w:t>
+      </w:r>
+    </w:p>
+    <w:p>
+      <w:pPr>
+        <w:pStyle w:val="SourceCode"/>
+      </w:pPr>
+      <w:r>
+        <w:t xml:space="preserve">000012 | </w:t>
+      </w:r>
+    </w:p>
+    <w:p>
+      <w:pPr>
+        <w:pStyle w:val="SourceCode"/>
+      </w:pPr>
+      <w:r>
+        <w:t>000013 | La clasificación automática genera propuestas que requieren revisión. Los archivos originales no se modifican. Los PDF derivados no conservan la validez de firmas digitales del original.</w:t>
+      </w:r>
+    </w:p>
+    <w:p>
+      <w:pPr>
+        <w:pStyle w:val="SourceCode"/>
+      </w:pPr>
+      <w:r>
+        <w:t xml:space="preserve">000014 | </w:t>
+      </w:r>
+    </w:p>
+    <w:p>
+      <w:pPr>
+        <w:pStyle w:val="SourceCode"/>
+      </w:pPr>
+      <w:r>
+        <w:t>000015 | ## Publicación</w:t>
+      </w:r>
+    </w:p>
+    <w:p>
+      <w:pPr>
+        <w:pStyle w:val="SourceCode"/>
+      </w:pPr>
+      <w:r>
+        <w:t xml:space="preserve">000016 | </w:t>
+      </w:r>
+    </w:p>
+    <w:p>
+      <w:pPr>
+        <w:pStyle w:val="SourceCode"/>
+      </w:pPr>
+      <w:r>
+        <w:t>000017 | En Settings → Pages seleccionar **GitHub Actions**. El flujo Publicar FONCEP genera y publica la aplicación con las bibliotecas y el modelo OCR incluidos. No hay dependencias de ChatGPT durante el uso ni en las publicaciones posteriores a la migración inicial.</w:t>
+      </w:r>
+    </w:p>
+    <w:p>
+      <w:pPr>
+        <w:pStyle w:val="SourceCode"/>
+      </w:pPr>
+      <w:r>
+        <w:t xml:space="preserve">000018 | </w:t>
+      </w:r>
+    </w:p>
+    <w:p>
+      <w:pPr>
+        <w:pStyle w:val="SourceCode"/>
+      </w:pPr>
+      <w:r>
+        <w:t>000019 | Dirección prevista: https://deivy199130-arch.github.io/foncep-organizador/</w:t>
+      </w:r>
+    </w:p>
+    <w:p>
+      <w:pPr>
+        <w:pStyle w:val="SourceCode"/>
+      </w:pPr>
+      <w:r>
+        <w:t xml:space="preserve">000020 | </w:t>
+      </w:r>
+    </w:p>
+    <w:p>
+      <w:pPr>
+        <w:pStyle w:val="SourceCode"/>
+      </w:pPr>
+      <w:r>
+        <w:t>000021 | ## Desarrollo</w:t>
+      </w:r>
+    </w:p>
+    <w:p>
+      <w:pPr>
+        <w:pStyle w:val="SourceCode"/>
+      </w:pPr>
+      <w:r>
+        <w:t xml:space="preserve">000022 | </w:t>
+      </w:r>
+    </w:p>
+    <w:p>
+      <w:pPr>
+        <w:pStyle w:val="SourceCode"/>
+      </w:pPr>
+      <w:r>
+        <w:t>000023 | Node.js 22. Ejecutar `npm ci --ignore-scripts`, `npm run build` y `npm test`. Servir la carpeta dist mediante HTTP. No subir expedientes ni datos personales a este repositorio público.</w:t>
+      </w:r>
+    </w:p>
+    <w:p>
+      <w:pPr>
+        <w:pStyle w:val="SourceCode"/>
+      </w:pPr>
+      <w:r>
+        <w:t xml:space="preserve">000024 | </w:t>
+      </w:r>
+    </w:p>
+    <w:p>
+      <w:pPr>
+        <w:pStyle w:val="SourceCode"/>
+      </w:pPr>
+      <w:r>
+        <w:t>000025 | Las verificaciones de distribución comprueban la sintaxis y los recursos necesarios. La versión original contó con pruebas sintéticas de organización y análisis; falta validar la clasificación con expedientes reales y comprobarla en el celular del usuario.</w:t>
+      </w:r>
+    </w:p>
+    <w:p>
+      <w:pPr>
+        <w:pStyle w:val="SourceCode"/>
+      </w:pPr>
+      <w:r>
+        <w:t xml:space="preserve">000026 | </w:t>
+      </w:r>
+    </w:p>
+    <w:p>
+      <w:r>
+        <w:br w:type="page"/>
+      </w:r>
+    </w:p>
+    <w:p>
+      <w:pPr>
+        <w:pStyle w:val="Heading1"/>
+      </w:pPr>
+      <w:r>
+        <w:t>17. Anexo: dependencias exactas y migración histórica</w:t>
+      </w:r>
+    </w:p>
+    <w:p>
+      <w:r>
+        <w:t>package-lock.json fue generado por npm y se incluye completo para conocer las versiones e integridades de los paquetes. No es código escrito manualmente. El flujo import.yml se recupera del historial y ya fue eliminado de main. Su URL antigua corresponde únicamente a la transferencia de una sola vez.</w:t>
+      </w:r>
+    </w:p>
+    <w:p>
+      <w:pPr>
+        <w:pStyle w:val="Heading2"/>
+      </w:pPr>
+      <w:r>
+        <w:t>17.1. package-lock.json completo</w:t>
+      </w:r>
+    </w:p>
+    <w:p>
+      <w:r>
+        <w:t>SHA-256 del archivo: 4303eb35d012460365a28a94c511978cec10bbc8eac43de902b03436e8118bbe</w:t>
+      </w:r>
+    </w:p>
+    <w:p>
+      <w:r>
+        <w:t xml:space="preserve">Fuente: </w:t>
+      </w:r>
+      <w:hyperlink r:id="rId37">
+        <w:r>
+          <w:rPr>
+            <w:color w:val="14665C"/>
+            <w:u w:val="single"/>
+          </w:rPr>
+          <w:t>https://github.com/deivy199130-arch/foncep-organizador/blob/d833fd8f00ea7bc127f380df4452c00ff74f2792/package-lock.json</w:t>
+        </w:r>
+      </w:hyperlink>
+      <w:r/>
+      <w:r/>
+    </w:p>
+    <w:p>
+      <w:r>
         <w:t>Líneas del archivo: 1056. El posible párrafo vacío final preserva un salto de línea de cierre.</w:t>
       </w:r>
     </w:p>
@@ -16105,7 +16921,7 @@
       <w:r>
         <w:t xml:space="preserve">Fuente: </w:t>
       </w:r>
-      <w:hyperlink r:id="rId37">
+      <w:hyperlink r:id="rId38">
         <w:r>
           <w:rPr>
             <w:color w:val="14665C"/>
@@ -16596,7 +17412,7 @@
               <w:rPr>
                 <w:sz w:val="18"/>
               </w:rPr>
-              <w:t>56c3d3351c05dec873ad03a79229c55810fc8af2</w:t>
+              <w:t>d833fd8f00ea7bc127f380df4452c00ff74f2792</w:t>
             </w:r>
           </w:p>
         </w:tc>
@@ -16612,7 +17428,7 @@
               <w:rPr>
                 <w:sz w:val="18"/>
               </w:rPr>
-              <w:t>10 / 047b5edce8fc309ddfa43bcf63c4da86f1b6c731d81197c855c790f2e2e11f7b</w:t>
+              <w:t>10 / 6862721175d21886064e7874761d7a5b630cad9414c97ac6a94e2d473f9afcb5</w:t>
             </w:r>
           </w:p>
         </w:tc>
@@ -16646,7 +17462,7 @@
               <w:rPr>
                 <w:sz w:val="18"/>
               </w:rPr>
-              <w:t>56c3d3351c05dec873ad03a79229c55810fc8af2</w:t>
+              <w:t>d833fd8f00ea7bc127f380df4452c00ff74f2792</w:t>
             </w:r>
           </w:p>
         </w:tc>
@@ -16696,7 +17512,7 @@
               <w:rPr>
                 <w:sz w:val="18"/>
               </w:rPr>
-              <w:t>56c3d3351c05dec873ad03a79229c55810fc8af2</w:t>
+              <w:t>d833fd8f00ea7bc127f380df4452c00ff74f2792</w:t>
             </w:r>
           </w:p>
         </w:tc>
@@ -16712,7 +17528,7 @@
               <w:rPr>
                 <w:sz w:val="18"/>
               </w:rPr>
-              <w:t>68 / bf81a3b4dd7760f95c36583c2e305769ce14da49314382ad49c226e6b0883591</w:t>
+              <w:t>72 / e267b8106c9d534cf380e6076c11a8e4ce1e467a9c323a2896bc17ca2285e038</w:t>
             </w:r>
           </w:p>
         </w:tc>
@@ -16746,7 +17562,7 @@
               <w:rPr>
                 <w:sz w:val="18"/>
               </w:rPr>
-              <w:t>56c3d3351c05dec873ad03a79229c55810fc8af2</w:t>
+              <w:t>d833fd8f00ea7bc127f380df4452c00ff74f2792</w:t>
             </w:r>
           </w:p>
         </w:tc>
@@ -16796,7 +17612,7 @@
               <w:rPr>
                 <w:sz w:val="18"/>
               </w:rPr>
-              <w:t>56c3d3351c05dec873ad03a79229c55810fc8af2</w:t>
+              <w:t>d833fd8f00ea7bc127f380df4452c00ff74f2792</w:t>
             </w:r>
           </w:p>
         </w:tc>
@@ -16846,7 +17662,7 @@
               <w:rPr>
                 <w:sz w:val="18"/>
               </w:rPr>
-              <w:t>56c3d3351c05dec873ad03a79229c55810fc8af2</w:t>
+              <w:t>d833fd8f00ea7bc127f380df4452c00ff74f2792</w:t>
             </w:r>
           </w:p>
         </w:tc>
@@ -16880,6 +17696,56 @@
               <w:rPr>
                 <w:sz w:val="18"/>
               </w:rPr>
+              <w:t>dist/catalog.js</w:t>
+            </w:r>
+          </w:p>
+        </w:tc>
+        <w:tc>
+          <w:tcPr>
+            <w:tcW w:type="dxa" w:w="5046"/>
+          </w:tcPr>
+          <w:p>
+            <w:pPr>
+              <w:spacing w:after="80"/>
+            </w:pPr>
+            <w:r>
+              <w:rPr>
+                <w:sz w:val="18"/>
+              </w:rPr>
+              <w:t>d833fd8f00ea7bc127f380df4452c00ff74f2792</w:t>
+            </w:r>
+          </w:p>
+        </w:tc>
+        <w:tc>
+          <w:tcPr>
+            <w:tcW w:type="dxa" w:w="5046"/>
+          </w:tcPr>
+          <w:p>
+            <w:pPr>
+              <w:spacing w:after="80"/>
+            </w:pPr>
+            <w:r>
+              <w:rPr>
+                <w:sz w:val="18"/>
+              </w:rPr>
+              <w:t>84 / 87e3f6581a227f9ec7973ff27a33572219c68c52226da3de2f89a2c6830538b4</w:t>
+            </w:r>
+          </w:p>
+        </w:tc>
+      </w:tr>
+      <w:tr>
+        <w:tc>
+          <w:tcPr>
+            <w:tcW w:type="dxa" w:w="5046"/>
+          </w:tcPr>
+          <w:p>
+            <w:pPr>
+              <w:spacing w:after="80"/>
+            </w:pPr>
+            <w:r>
+              <w:rPr>
+                <w:sz w:val="18"/>
+              </w:rPr>
               <w:t>build.cjs</w:t>
             </w:r>
           </w:p>
@@ -16896,7 +17762,7 @@
               <w:rPr>
                 <w:sz w:val="18"/>
               </w:rPr>
-              <w:t>56c3d3351c05dec873ad03a79229c55810fc8af2</w:t>
+              <w:t>d833fd8f00ea7bc127f380df4452c00ff74f2792</w:t>
             </w:r>
           </w:p>
         </w:tc>
@@ -16946,7 +17812,7 @@
               <w:rPr>
                 <w:sz w:val="18"/>
               </w:rPr>
-              <w:t>56c3d3351c05dec873ad03a79229c55810fc8af2</w:t>
+              <w:t>d833fd8f00ea7bc127f380df4452c00ff74f2792</w:t>
             </w:r>
           </w:p>
         </w:tc>
@@ -16962,7 +17828,7 @@
               <w:rPr>
                 <w:sz w:val="18"/>
               </w:rPr>
-              <w:t>5 / ddcbbfec6933b40e13789c172bd16c3119b0c37ca46ae119d54a2e7f2ca73c23</w:t>
+              <w:t>5 / 39bc093660dd494cff6f7a62f3e640f833e60b5c280d2e7c8ccdf14bc10a26b8</w:t>
             </w:r>
           </w:p>
         </w:tc>
@@ -16996,7 +17862,7 @@
               <w:rPr>
                 <w:sz w:val="18"/>
               </w:rPr>
-              <w:t>56c3d3351c05dec873ad03a79229c55810fc8af2</w:t>
+              <w:t>d833fd8f00ea7bc127f380df4452c00ff74f2792</w:t>
             </w:r>
           </w:p>
         </w:tc>
@@ -17046,7 +17912,7 @@
               <w:rPr>
                 <w:sz w:val="18"/>
               </w:rPr>
-              <w:t>56c3d3351c05dec873ad03a79229c55810fc8af2</w:t>
+              <w:t>d833fd8f00ea7bc127f380df4452c00ff74f2792</w:t>
             </w:r>
           </w:p>
         </w:tc>
@@ -17096,7 +17962,7 @@
               <w:rPr>
                 <w:sz w:val="18"/>
               </w:rPr>
-              <w:t>56c3d3351c05dec873ad03a79229c55810fc8af2</w:t>
+              <w:t>d833fd8f00ea7bc127f380df4452c00ff74f2792</w:t>
             </w:r>
           </w:p>
         </w:tc>
@@ -17146,7 +18012,7 @@
               <w:rPr>
                 <w:sz w:val="18"/>
               </w:rPr>
-              <w:t>56c3d3351c05dec873ad03a79229c55810fc8af2</w:t>
+              <w:t>d833fd8f00ea7bc127f380df4452c00ff74f2792</w:t>
             </w:r>
           </w:p>
         </w:tc>
@@ -17196,7 +18062,7 @@
               <w:rPr>
                 <w:sz w:val="18"/>
               </w:rPr>
-              <w:t>56c3d3351c05dec873ad03a79229c55810fc8af2</w:t>
+              <w:t>d833fd8f00ea7bc127f380df4452c00ff74f2792</w:t>
             </w:r>
           </w:p>
         </w:tc>

</xml_diff>